<commit_message>
advanced rag, with parent - child chunking
</commit_message>
<xml_diff>
--- a/doc/VTAgent_SAD_v1_0.docx
+++ b/doc/VTAgent_SAD_v1_0.docx
@@ -20,7 +20,27 @@
           <w:sz w:val="32"/>
           <w:szCs w:val="32"/>
         </w:rPr>
-        <w:t>NGHIÊN CỨU VÀ ỨNG DỤNG KIẾN TRÚC MULTI-AGENT KẾT HỢP ADVANCED RAG TRONG TRÍCH XUẤT DỮ LIỆU PHI CẤU TRÚC NỘI BỘ BẢO MẬT</w:t>
+        <w:t xml:space="preserve">NGHIÊN CỨU VÀ ỨNG DỤNG KIẾN TRÚC MULTI-AGENT KẾT HỢP ADVANCED RAG TRONG TRÍCH </w:t>
+      </w:r>
+      <w:r>
+        <w:rPr>
+          <w:b/>
+          <w:bCs/>
+          <w:color w:val="0F4761" w:themeColor="accent1" w:themeShade="BF"/>
+          <w:sz w:val="32"/>
+          <w:szCs w:val="32"/>
+        </w:rPr>
+        <w:t>DẪN</w:t>
+      </w:r>
+      <w:r>
+        <w:rPr>
+          <w:b/>
+          <w:bCs/>
+          <w:color w:val="0F4761" w:themeColor="accent1" w:themeShade="BF"/>
+          <w:sz w:val="32"/>
+          <w:szCs w:val="32"/>
+        </w:rPr>
+        <w:t xml:space="preserve"> DỮ LIỆU PHI CẤU TRÚC NỘI BỘ BẢO MẬT</w:t>
       </w:r>
     </w:p>
     <w:p>
@@ -7105,7 +7125,25 @@
                 <w:sz w:val="26"/>
                 <w:szCs w:val="26"/>
               </w:rPr>
-              <w:t>10.1. Chỉ số đánh giá</w:t>
+              <w:t>10.1. Chỉ s</w:t>
+            </w:r>
+            <w:r>
+              <w:rPr>
+                <w:rStyle w:val="Hyperlink"/>
+                <w:noProof/>
+                <w:sz w:val="26"/>
+                <w:szCs w:val="26"/>
+              </w:rPr>
+              <w:t>ố</w:t>
+            </w:r>
+            <w:r>
+              <w:rPr>
+                <w:rStyle w:val="Hyperlink"/>
+                <w:noProof/>
+                <w:sz w:val="26"/>
+                <w:szCs w:val="26"/>
+              </w:rPr>
+              <w:t xml:space="preserve"> đánh giá</w:t>
             </w:r>
             <w:r>
               <w:rPr>
@@ -38572,7 +38610,13 @@
     <w:tbl>
       <w:tblPr>
         <w:tblW w:w="0" w:type="auto"/>
-        <w:tblCellSpacing w:w="15" w:type="dxa"/>
+        <w:tblBorders>
+          <w:top w:val="single" w:sz="4" w:space="0" w:color="2A2B2C"/>
+          <w:left w:val="single" w:sz="4" w:space="0" w:color="2A2B2C"/>
+          <w:bottom w:val="single" w:sz="4" w:space="0" w:color="2A2B2C"/>
+          <w:right w:val="single" w:sz="4" w:space="0" w:color="2A2B2C"/>
+        </w:tblBorders>
+        <w:shd w:val="clear" w:color="auto" w:fill="191A1B"/>
         <w:tblCellMar>
           <w:top w:w="15" w:type="dxa"/>
           <w:left w:w="15" w:type="dxa"/>
@@ -38582,26 +38626,38 @@
         <w:tblLook w:val="04A0" w:firstRow="1" w:lastRow="0" w:firstColumn="1" w:lastColumn="0" w:noHBand="0" w:noVBand="1"/>
       </w:tblPr>
       <w:tblGrid>
-        <w:gridCol w:w="1541"/>
-        <w:gridCol w:w="3468"/>
-        <w:gridCol w:w="2968"/>
-        <w:gridCol w:w="1049"/>
+        <w:gridCol w:w="321"/>
+        <w:gridCol w:w="1665"/>
+        <w:gridCol w:w="2407"/>
+        <w:gridCol w:w="1640"/>
+        <w:gridCol w:w="1851"/>
+        <w:gridCol w:w="1132"/>
       </w:tblGrid>
       <w:tr>
         <w:trPr>
           <w:tblHeader/>
-          <w:tblCellSpacing w:w="15" w:type="dxa"/>
         </w:trPr>
         <w:tc>
           <w:tcPr>
             <w:tcW w:w="0" w:type="auto"/>
+            <w:tcBorders>
+              <w:top w:val="single" w:sz="4" w:space="0" w:color="2A2B2C"/>
+              <w:left w:val="single" w:sz="4" w:space="0" w:color="2A2B2C"/>
+              <w:bottom w:val="single" w:sz="4" w:space="0" w:color="2A2B2C"/>
+              <w:right w:val="single" w:sz="4" w:space="0" w:color="2A2B2C"/>
+            </w:tcBorders>
+            <w:tcMar>
+              <w:top w:w="30" w:type="dxa"/>
+              <w:left w:w="30" w:type="dxa"/>
+              <w:bottom w:w="30" w:type="dxa"/>
+              <w:right w:w="30" w:type="dxa"/>
+            </w:tcMar>
             <w:vAlign w:val="center"/>
             <w:hideMark/>
           </w:tcPr>
           <w:p>
             <w:pPr>
               <w:spacing w:before="80" w:after="220"/>
-              <w:jc w:val="center"/>
               <w:rPr>
                 <w:b/>
                 <w:bCs/>
@@ -38616,20 +38672,31 @@
                 <w:sz w:val="26"/>
                 <w:szCs w:val="26"/>
               </w:rPr>
-              <w:t>Tầng</w:t>
+              <w:t>#</w:t>
             </w:r>
           </w:p>
         </w:tc>
         <w:tc>
           <w:tcPr>
             <w:tcW w:w="0" w:type="auto"/>
+            <w:tcBorders>
+              <w:top w:val="single" w:sz="4" w:space="0" w:color="2A2B2C"/>
+              <w:left w:val="single" w:sz="4" w:space="0" w:color="2A2B2C"/>
+              <w:bottom w:val="single" w:sz="4" w:space="0" w:color="2A2B2C"/>
+              <w:right w:val="single" w:sz="4" w:space="0" w:color="2A2B2C"/>
+            </w:tcBorders>
+            <w:tcMar>
+              <w:top w:w="30" w:type="dxa"/>
+              <w:left w:w="30" w:type="dxa"/>
+              <w:bottom w:w="30" w:type="dxa"/>
+              <w:right w:w="30" w:type="dxa"/>
+            </w:tcMar>
             <w:vAlign w:val="center"/>
             <w:hideMark/>
           </w:tcPr>
           <w:p>
             <w:pPr>
               <w:spacing w:before="80" w:after="220"/>
-              <w:jc w:val="center"/>
               <w:rPr>
                 <w:b/>
                 <w:bCs/>
@@ -38644,20 +38711,31 @@
                 <w:sz w:val="26"/>
                 <w:szCs w:val="26"/>
               </w:rPr>
-              <w:t>Chỉ số</w:t>
+              <w:t>Tầng</w:t>
             </w:r>
           </w:p>
         </w:tc>
         <w:tc>
           <w:tcPr>
             <w:tcW w:w="0" w:type="auto"/>
+            <w:tcBorders>
+              <w:top w:val="single" w:sz="4" w:space="0" w:color="2A2B2C"/>
+              <w:left w:val="single" w:sz="4" w:space="0" w:color="2A2B2C"/>
+              <w:bottom w:val="single" w:sz="4" w:space="0" w:color="2A2B2C"/>
+              <w:right w:val="single" w:sz="4" w:space="0" w:color="2A2B2C"/>
+            </w:tcBorders>
+            <w:tcMar>
+              <w:top w:w="30" w:type="dxa"/>
+              <w:left w:w="30" w:type="dxa"/>
+              <w:bottom w:w="30" w:type="dxa"/>
+              <w:right w:w="30" w:type="dxa"/>
+            </w:tcMar>
             <w:vAlign w:val="center"/>
             <w:hideMark/>
           </w:tcPr>
           <w:p>
             <w:pPr>
               <w:spacing w:before="80" w:after="220"/>
-              <w:jc w:val="center"/>
               <w:rPr>
                 <w:b/>
                 <w:bCs/>
@@ -38672,20 +38750,31 @@
                 <w:sz w:val="26"/>
                 <w:szCs w:val="26"/>
               </w:rPr>
-              <w:t>Cách tính</w:t>
+              <w:t>Chỉ số</w:t>
             </w:r>
           </w:p>
         </w:tc>
         <w:tc>
           <w:tcPr>
             <w:tcW w:w="0" w:type="auto"/>
+            <w:tcBorders>
+              <w:top w:val="single" w:sz="4" w:space="0" w:color="2A2B2C"/>
+              <w:left w:val="single" w:sz="4" w:space="0" w:color="2A2B2C"/>
+              <w:bottom w:val="single" w:sz="4" w:space="0" w:color="2A2B2C"/>
+              <w:right w:val="single" w:sz="4" w:space="0" w:color="2A2B2C"/>
+            </w:tcBorders>
+            <w:tcMar>
+              <w:top w:w="30" w:type="dxa"/>
+              <w:left w:w="30" w:type="dxa"/>
+              <w:bottom w:w="30" w:type="dxa"/>
+              <w:right w:w="30" w:type="dxa"/>
+            </w:tcMar>
             <w:vAlign w:val="center"/>
             <w:hideMark/>
           </w:tcPr>
           <w:p>
             <w:pPr>
               <w:spacing w:before="80" w:after="220"/>
-              <w:jc w:val="center"/>
               <w:rPr>
                 <w:b/>
                 <w:bCs/>
@@ -38700,25 +38789,146 @@
                 <w:sz w:val="26"/>
                 <w:szCs w:val="26"/>
               </w:rPr>
-              <w:t>Cần LLM?</w:t>
+              <w:t>Cách đo</w:t>
+            </w:r>
+          </w:p>
+        </w:tc>
+        <w:tc>
+          <w:tcPr>
+            <w:tcW w:w="0" w:type="auto"/>
+            <w:tcBorders>
+              <w:top w:val="single" w:sz="4" w:space="0" w:color="2A2B2C"/>
+              <w:left w:val="single" w:sz="4" w:space="0" w:color="2A2B2C"/>
+              <w:bottom w:val="single" w:sz="4" w:space="0" w:color="2A2B2C"/>
+              <w:right w:val="single" w:sz="4" w:space="0" w:color="2A2B2C"/>
+            </w:tcBorders>
+            <w:tcMar>
+              <w:top w:w="30" w:type="dxa"/>
+              <w:left w:w="30" w:type="dxa"/>
+              <w:bottom w:w="30" w:type="dxa"/>
+              <w:right w:w="30" w:type="dxa"/>
+            </w:tcMar>
+            <w:vAlign w:val="center"/>
+            <w:hideMark/>
+          </w:tcPr>
+          <w:p>
+            <w:pPr>
+              <w:spacing w:before="80" w:after="220"/>
+              <w:rPr>
+                <w:b/>
+                <w:bCs/>
+                <w:sz w:val="26"/>
+                <w:szCs w:val="26"/>
+              </w:rPr>
+            </w:pPr>
+            <w:r>
+              <w:rPr>
+                <w:b/>
+                <w:bCs/>
+                <w:sz w:val="26"/>
+                <w:szCs w:val="26"/>
+              </w:rPr>
+              <w:t>Cần nhãn</w:t>
+            </w:r>
+          </w:p>
+        </w:tc>
+        <w:tc>
+          <w:tcPr>
+            <w:tcW w:w="0" w:type="auto"/>
+            <w:tcBorders>
+              <w:top w:val="single" w:sz="4" w:space="0" w:color="2A2B2C"/>
+              <w:left w:val="single" w:sz="4" w:space="0" w:color="2A2B2C"/>
+              <w:bottom w:val="single" w:sz="4" w:space="0" w:color="2A2B2C"/>
+              <w:right w:val="single" w:sz="4" w:space="0" w:color="2A2B2C"/>
+            </w:tcBorders>
+            <w:tcMar>
+              <w:top w:w="30" w:type="dxa"/>
+              <w:left w:w="30" w:type="dxa"/>
+              <w:bottom w:w="30" w:type="dxa"/>
+              <w:right w:w="30" w:type="dxa"/>
+            </w:tcMar>
+            <w:vAlign w:val="center"/>
+            <w:hideMark/>
+          </w:tcPr>
+          <w:p>
+            <w:pPr>
+              <w:spacing w:before="80" w:after="220"/>
+              <w:rPr>
+                <w:b/>
+                <w:bCs/>
+                <w:sz w:val="26"/>
+                <w:szCs w:val="26"/>
+              </w:rPr>
+            </w:pPr>
+            <w:r>
+              <w:rPr>
+                <w:b/>
+                <w:bCs/>
+                <w:sz w:val="26"/>
+                <w:szCs w:val="26"/>
+              </w:rPr>
+              <w:t>Vai trò</w:t>
             </w:r>
           </w:p>
         </w:tc>
       </w:tr>
       <w:tr>
-        <w:trPr>
-          <w:tblCellSpacing w:w="15" w:type="dxa"/>
-        </w:trPr>
         <w:tc>
           <w:tcPr>
             <w:tcW w:w="0" w:type="auto"/>
+            <w:tcBorders>
+              <w:top w:val="single" w:sz="4" w:space="0" w:color="2A2B2C"/>
+              <w:left w:val="single" w:sz="4" w:space="0" w:color="2A2B2C"/>
+              <w:bottom w:val="single" w:sz="4" w:space="0" w:color="2A2B2C"/>
+              <w:right w:val="single" w:sz="4" w:space="0" w:color="2A2B2C"/>
+            </w:tcBorders>
+            <w:tcMar>
+              <w:top w:w="30" w:type="dxa"/>
+              <w:left w:w="30" w:type="dxa"/>
+              <w:bottom w:w="30" w:type="dxa"/>
+              <w:right w:w="30" w:type="dxa"/>
+            </w:tcMar>
             <w:vAlign w:val="center"/>
             <w:hideMark/>
           </w:tcPr>
           <w:p>
             <w:pPr>
               <w:spacing w:before="80" w:after="220"/>
-              <w:jc w:val="center"/>
+              <w:rPr>
+                <w:sz w:val="26"/>
+                <w:szCs w:val="26"/>
+              </w:rPr>
+            </w:pPr>
+            <w:r>
+              <w:rPr>
+                <w:sz w:val="26"/>
+                <w:szCs w:val="26"/>
+              </w:rPr>
+              <w:t>1</w:t>
+            </w:r>
+          </w:p>
+        </w:tc>
+        <w:tc>
+          <w:tcPr>
+            <w:tcW w:w="0" w:type="auto"/>
+            <w:vMerge w:val="restart"/>
+            <w:tcBorders>
+              <w:top w:val="single" w:sz="4" w:space="0" w:color="2A2B2C"/>
+              <w:left w:val="single" w:sz="4" w:space="0" w:color="2A2B2C"/>
+              <w:right w:val="single" w:sz="4" w:space="0" w:color="2A2B2C"/>
+            </w:tcBorders>
+            <w:tcMar>
+              <w:top w:w="30" w:type="dxa"/>
+              <w:left w:w="30" w:type="dxa"/>
+              <w:bottom w:w="30" w:type="dxa"/>
+              <w:right w:w="30" w:type="dxa"/>
+            </w:tcMar>
+            <w:vAlign w:val="center"/>
+            <w:hideMark/>
+          </w:tcPr>
+          <w:p>
+            <w:pPr>
+              <w:spacing w:before="80" w:after="220"/>
               <w:rPr>
                 <w:sz w:val="26"/>
                 <w:szCs w:val="26"/>
@@ -38731,98 +38941,1043 @@
                 <w:sz w:val="26"/>
                 <w:szCs w:val="26"/>
               </w:rPr>
-              <w:t>1. Truy xuất</w:t>
+              <w:t>Retrieval</w:t>
             </w:r>
           </w:p>
         </w:tc>
         <w:tc>
           <w:tcPr>
             <w:tcW w:w="0" w:type="auto"/>
+            <w:tcBorders>
+              <w:top w:val="single" w:sz="4" w:space="0" w:color="2A2B2C"/>
+              <w:left w:val="single" w:sz="4" w:space="0" w:color="2A2B2C"/>
+              <w:bottom w:val="single" w:sz="4" w:space="0" w:color="2A2B2C"/>
+              <w:right w:val="single" w:sz="4" w:space="0" w:color="2A2B2C"/>
+            </w:tcBorders>
+            <w:shd w:val="clear" w:color="auto" w:fill="B3E5A1" w:themeFill="accent6" w:themeFillTint="66"/>
+            <w:tcMar>
+              <w:top w:w="30" w:type="dxa"/>
+              <w:left w:w="30" w:type="dxa"/>
+              <w:bottom w:w="30" w:type="dxa"/>
+              <w:right w:w="30" w:type="dxa"/>
+            </w:tcMar>
             <w:vAlign w:val="center"/>
             <w:hideMark/>
           </w:tcPr>
           <w:p>
             <w:pPr>
               <w:spacing w:before="80" w:after="220"/>
-              <w:jc w:val="center"/>
-              <w:rPr>
-                <w:sz w:val="26"/>
-                <w:szCs w:val="26"/>
-              </w:rPr>
-            </w:pPr>
-            <w:r>
-              <w:rPr>
-                <w:sz w:val="26"/>
-                <w:szCs w:val="26"/>
-              </w:rPr>
-              <w:t>Recall@5, Recall@40, MRR, nDCG@10</w:t>
+              <w:rPr>
+                <w:sz w:val="26"/>
+                <w:szCs w:val="26"/>
+              </w:rPr>
+            </w:pPr>
+            <w:r>
+              <w:rPr>
+                <w:sz w:val="26"/>
+                <w:szCs w:val="26"/>
+              </w:rPr>
+              <w:t>Recall@5</w:t>
             </w:r>
           </w:p>
         </w:tc>
         <w:tc>
           <w:tcPr>
             <w:tcW w:w="0" w:type="auto"/>
+            <w:tcBorders>
+              <w:top w:val="single" w:sz="4" w:space="0" w:color="2A2B2C"/>
+              <w:left w:val="single" w:sz="4" w:space="0" w:color="2A2B2C"/>
+              <w:bottom w:val="single" w:sz="4" w:space="0" w:color="2A2B2C"/>
+              <w:right w:val="single" w:sz="4" w:space="0" w:color="2A2B2C"/>
+            </w:tcBorders>
+            <w:tcMar>
+              <w:top w:w="30" w:type="dxa"/>
+              <w:left w:w="30" w:type="dxa"/>
+              <w:bottom w:w="30" w:type="dxa"/>
+              <w:right w:w="30" w:type="dxa"/>
+            </w:tcMar>
             <w:vAlign w:val="center"/>
             <w:hideMark/>
           </w:tcPr>
           <w:p>
             <w:pPr>
               <w:spacing w:before="80" w:after="220"/>
-              <w:jc w:val="center"/>
-              <w:rPr>
-                <w:sz w:val="26"/>
-                <w:szCs w:val="26"/>
-              </w:rPr>
-            </w:pPr>
-            <w:r>
-              <w:rPr>
-                <w:sz w:val="26"/>
-                <w:szCs w:val="26"/>
-              </w:rPr>
-              <w:t>So đoạn truy xuất với vùng đáp án chuẩn</w:t>
+              <w:rPr>
+                <w:sz w:val="26"/>
+                <w:szCs w:val="26"/>
+              </w:rPr>
+            </w:pPr>
+            <w:r>
+              <w:rPr>
+                <w:sz w:val="26"/>
+                <w:szCs w:val="26"/>
+              </w:rPr>
+              <w:t>Code</w:t>
             </w:r>
           </w:p>
         </w:tc>
         <w:tc>
           <w:tcPr>
             <w:tcW w:w="0" w:type="auto"/>
+            <w:tcBorders>
+              <w:top w:val="single" w:sz="4" w:space="0" w:color="2A2B2C"/>
+              <w:left w:val="single" w:sz="4" w:space="0" w:color="2A2B2C"/>
+              <w:bottom w:val="single" w:sz="4" w:space="0" w:color="2A2B2C"/>
+              <w:right w:val="single" w:sz="4" w:space="0" w:color="2A2B2C"/>
+            </w:tcBorders>
+            <w:tcMar>
+              <w:top w:w="30" w:type="dxa"/>
+              <w:left w:w="30" w:type="dxa"/>
+              <w:bottom w:w="30" w:type="dxa"/>
+              <w:right w:w="30" w:type="dxa"/>
+            </w:tcMar>
             <w:vAlign w:val="center"/>
             <w:hideMark/>
           </w:tcPr>
           <w:p>
             <w:pPr>
               <w:spacing w:before="80" w:after="220"/>
-              <w:jc w:val="center"/>
-              <w:rPr>
-                <w:sz w:val="26"/>
-                <w:szCs w:val="26"/>
-              </w:rPr>
-            </w:pPr>
-            <w:r>
-              <w:rPr>
-                <w:sz w:val="26"/>
-                <w:szCs w:val="26"/>
-              </w:rPr>
-              <w:t>Không</w:t>
+              <w:rPr>
+                <w:sz w:val="26"/>
+                <w:szCs w:val="26"/>
+              </w:rPr>
+            </w:pPr>
+            <w:r>
+              <w:rPr>
+                <w:sz w:val="26"/>
+                <w:szCs w:val="26"/>
+              </w:rPr>
+              <w:t>evidence</w:t>
+            </w:r>
+          </w:p>
+        </w:tc>
+        <w:tc>
+          <w:tcPr>
+            <w:tcW w:w="0" w:type="auto"/>
+            <w:tcBorders>
+              <w:top w:val="single" w:sz="4" w:space="0" w:color="2A2B2C"/>
+              <w:left w:val="single" w:sz="4" w:space="0" w:color="2A2B2C"/>
+              <w:bottom w:val="single" w:sz="4" w:space="0" w:color="2A2B2C"/>
+              <w:right w:val="single" w:sz="4" w:space="0" w:color="2A2B2C"/>
+            </w:tcBorders>
+            <w:tcMar>
+              <w:top w:w="30" w:type="dxa"/>
+              <w:left w:w="30" w:type="dxa"/>
+              <w:bottom w:w="30" w:type="dxa"/>
+              <w:right w:w="30" w:type="dxa"/>
+            </w:tcMar>
+            <w:vAlign w:val="center"/>
+            <w:hideMark/>
+          </w:tcPr>
+          <w:p>
+            <w:pPr>
+              <w:spacing w:before="80" w:after="220"/>
+              <w:rPr>
+                <w:sz w:val="26"/>
+                <w:szCs w:val="26"/>
+              </w:rPr>
+            </w:pPr>
+            <w:r>
+              <w:rPr>
+                <w:rFonts w:ascii="Segoe UI Emoji" w:hAnsi="Segoe UI Emoji" w:cs="Segoe UI Emoji"/>
+                <w:sz w:val="26"/>
+                <w:szCs w:val="26"/>
+              </w:rPr>
+              <w:t>⭐</w:t>
+            </w:r>
+            <w:r>
+              <w:rPr>
+                <w:sz w:val="26"/>
+                <w:szCs w:val="26"/>
+              </w:rPr>
+              <w:t xml:space="preserve"> Chính</w:t>
             </w:r>
           </w:p>
         </w:tc>
       </w:tr>
       <w:tr>
-        <w:trPr>
-          <w:tblCellSpacing w:w="15" w:type="dxa"/>
-        </w:trPr>
+        <w:tc>
+          <w:tcPr>
+            <w:tcW w:w="0" w:type="auto"/>
+            <w:tcBorders>
+              <w:top w:val="single" w:sz="4" w:space="0" w:color="2A2B2C"/>
+              <w:left w:val="single" w:sz="4" w:space="0" w:color="2A2B2C"/>
+              <w:bottom w:val="single" w:sz="4" w:space="0" w:color="2A2B2C"/>
+              <w:right w:val="single" w:sz="4" w:space="0" w:color="2A2B2C"/>
+            </w:tcBorders>
+            <w:tcMar>
+              <w:top w:w="30" w:type="dxa"/>
+              <w:left w:w="30" w:type="dxa"/>
+              <w:bottom w:w="30" w:type="dxa"/>
+              <w:right w:w="30" w:type="dxa"/>
+            </w:tcMar>
+            <w:vAlign w:val="center"/>
+            <w:hideMark/>
+          </w:tcPr>
+          <w:p>
+            <w:pPr>
+              <w:spacing w:before="80" w:after="220"/>
+              <w:rPr>
+                <w:sz w:val="26"/>
+                <w:szCs w:val="26"/>
+              </w:rPr>
+            </w:pPr>
+            <w:r>
+              <w:rPr>
+                <w:sz w:val="26"/>
+                <w:szCs w:val="26"/>
+              </w:rPr>
+              <w:t>2</w:t>
+            </w:r>
+          </w:p>
+        </w:tc>
+        <w:tc>
+          <w:tcPr>
+            <w:tcW w:w="0" w:type="auto"/>
+            <w:vMerge/>
+            <w:tcBorders>
+              <w:left w:val="single" w:sz="4" w:space="0" w:color="2A2B2C"/>
+              <w:right w:val="single" w:sz="4" w:space="0" w:color="2A2B2C"/>
+            </w:tcBorders>
+            <w:tcMar>
+              <w:top w:w="30" w:type="dxa"/>
+              <w:left w:w="30" w:type="dxa"/>
+              <w:bottom w:w="30" w:type="dxa"/>
+              <w:right w:w="30" w:type="dxa"/>
+            </w:tcMar>
+            <w:vAlign w:val="center"/>
+            <w:hideMark/>
+          </w:tcPr>
+          <w:p>
+            <w:pPr>
+              <w:spacing w:before="80" w:after="220"/>
+              <w:rPr>
+                <w:sz w:val="26"/>
+                <w:szCs w:val="26"/>
+              </w:rPr>
+            </w:pPr>
+          </w:p>
+        </w:tc>
+        <w:tc>
+          <w:tcPr>
+            <w:tcW w:w="0" w:type="auto"/>
+            <w:tcBorders>
+              <w:top w:val="single" w:sz="4" w:space="0" w:color="2A2B2C"/>
+              <w:left w:val="single" w:sz="4" w:space="0" w:color="2A2B2C"/>
+              <w:bottom w:val="single" w:sz="4" w:space="0" w:color="2A2B2C"/>
+              <w:right w:val="single" w:sz="4" w:space="0" w:color="2A2B2C"/>
+            </w:tcBorders>
+            <w:shd w:val="clear" w:color="auto" w:fill="B3E5A1" w:themeFill="accent6" w:themeFillTint="66"/>
+            <w:tcMar>
+              <w:top w:w="30" w:type="dxa"/>
+              <w:left w:w="30" w:type="dxa"/>
+              <w:bottom w:w="30" w:type="dxa"/>
+              <w:right w:w="30" w:type="dxa"/>
+            </w:tcMar>
+            <w:vAlign w:val="center"/>
+            <w:hideMark/>
+          </w:tcPr>
+          <w:p>
+            <w:pPr>
+              <w:spacing w:before="80" w:after="220"/>
+              <w:rPr>
+                <w:sz w:val="26"/>
+                <w:szCs w:val="26"/>
+              </w:rPr>
+            </w:pPr>
+            <w:r>
+              <w:rPr>
+                <w:sz w:val="26"/>
+                <w:szCs w:val="26"/>
+              </w:rPr>
+              <w:t>MRR</w:t>
+            </w:r>
+          </w:p>
+        </w:tc>
+        <w:tc>
+          <w:tcPr>
+            <w:tcW w:w="0" w:type="auto"/>
+            <w:tcBorders>
+              <w:top w:val="single" w:sz="4" w:space="0" w:color="2A2B2C"/>
+              <w:left w:val="single" w:sz="4" w:space="0" w:color="2A2B2C"/>
+              <w:bottom w:val="single" w:sz="4" w:space="0" w:color="2A2B2C"/>
+              <w:right w:val="single" w:sz="4" w:space="0" w:color="2A2B2C"/>
+            </w:tcBorders>
+            <w:tcMar>
+              <w:top w:w="30" w:type="dxa"/>
+              <w:left w:w="30" w:type="dxa"/>
+              <w:bottom w:w="30" w:type="dxa"/>
+              <w:right w:w="30" w:type="dxa"/>
+            </w:tcMar>
+            <w:vAlign w:val="center"/>
+            <w:hideMark/>
+          </w:tcPr>
+          <w:p>
+            <w:pPr>
+              <w:spacing w:before="80" w:after="220"/>
+              <w:rPr>
+                <w:sz w:val="26"/>
+                <w:szCs w:val="26"/>
+              </w:rPr>
+            </w:pPr>
+            <w:r>
+              <w:rPr>
+                <w:sz w:val="26"/>
+                <w:szCs w:val="26"/>
+              </w:rPr>
+              <w:t>Code</w:t>
+            </w:r>
+          </w:p>
+        </w:tc>
+        <w:tc>
+          <w:tcPr>
+            <w:tcW w:w="0" w:type="auto"/>
+            <w:tcBorders>
+              <w:top w:val="single" w:sz="4" w:space="0" w:color="2A2B2C"/>
+              <w:left w:val="single" w:sz="4" w:space="0" w:color="2A2B2C"/>
+              <w:bottom w:val="single" w:sz="4" w:space="0" w:color="2A2B2C"/>
+              <w:right w:val="single" w:sz="4" w:space="0" w:color="2A2B2C"/>
+            </w:tcBorders>
+            <w:tcMar>
+              <w:top w:w="30" w:type="dxa"/>
+              <w:left w:w="30" w:type="dxa"/>
+              <w:bottom w:w="30" w:type="dxa"/>
+              <w:right w:w="30" w:type="dxa"/>
+            </w:tcMar>
+            <w:vAlign w:val="center"/>
+            <w:hideMark/>
+          </w:tcPr>
+          <w:p>
+            <w:pPr>
+              <w:spacing w:before="80" w:after="220"/>
+              <w:rPr>
+                <w:sz w:val="26"/>
+                <w:szCs w:val="26"/>
+              </w:rPr>
+            </w:pPr>
+            <w:r>
+              <w:rPr>
+                <w:sz w:val="26"/>
+                <w:szCs w:val="26"/>
+              </w:rPr>
+              <w:t>evidence</w:t>
+            </w:r>
+          </w:p>
+        </w:tc>
+        <w:tc>
+          <w:tcPr>
+            <w:tcW w:w="0" w:type="auto"/>
+            <w:tcBorders>
+              <w:top w:val="single" w:sz="4" w:space="0" w:color="2A2B2C"/>
+              <w:left w:val="single" w:sz="4" w:space="0" w:color="2A2B2C"/>
+              <w:bottom w:val="single" w:sz="4" w:space="0" w:color="2A2B2C"/>
+              <w:right w:val="single" w:sz="4" w:space="0" w:color="2A2B2C"/>
+            </w:tcBorders>
+            <w:tcMar>
+              <w:top w:w="30" w:type="dxa"/>
+              <w:left w:w="30" w:type="dxa"/>
+              <w:bottom w:w="30" w:type="dxa"/>
+              <w:right w:w="30" w:type="dxa"/>
+            </w:tcMar>
+            <w:vAlign w:val="center"/>
+            <w:hideMark/>
+          </w:tcPr>
+          <w:p>
+            <w:pPr>
+              <w:spacing w:before="80" w:after="220"/>
+              <w:rPr>
+                <w:sz w:val="26"/>
+                <w:szCs w:val="26"/>
+              </w:rPr>
+            </w:pPr>
+            <w:r>
+              <w:rPr>
+                <w:rFonts w:ascii="Segoe UI Emoji" w:hAnsi="Segoe UI Emoji" w:cs="Segoe UI Emoji"/>
+                <w:sz w:val="26"/>
+                <w:szCs w:val="26"/>
+              </w:rPr>
+              <w:t>⭐</w:t>
+            </w:r>
+            <w:r>
+              <w:rPr>
+                <w:sz w:val="26"/>
+                <w:szCs w:val="26"/>
+              </w:rPr>
+              <w:t xml:space="preserve"> Chính</w:t>
+            </w:r>
+          </w:p>
+        </w:tc>
+      </w:tr>
+      <w:tr>
+        <w:tc>
+          <w:tcPr>
+            <w:tcW w:w="0" w:type="auto"/>
+            <w:tcBorders>
+              <w:top w:val="single" w:sz="4" w:space="0" w:color="2A2B2C"/>
+              <w:left w:val="single" w:sz="4" w:space="0" w:color="2A2B2C"/>
+              <w:bottom w:val="single" w:sz="4" w:space="0" w:color="2A2B2C"/>
+              <w:right w:val="single" w:sz="4" w:space="0" w:color="2A2B2C"/>
+            </w:tcBorders>
+            <w:tcMar>
+              <w:top w:w="30" w:type="dxa"/>
+              <w:left w:w="30" w:type="dxa"/>
+              <w:bottom w:w="30" w:type="dxa"/>
+              <w:right w:w="30" w:type="dxa"/>
+            </w:tcMar>
+            <w:vAlign w:val="center"/>
+            <w:hideMark/>
+          </w:tcPr>
+          <w:p>
+            <w:pPr>
+              <w:spacing w:before="80" w:after="220"/>
+              <w:rPr>
+                <w:sz w:val="26"/>
+                <w:szCs w:val="26"/>
+              </w:rPr>
+            </w:pPr>
+            <w:r>
+              <w:rPr>
+                <w:sz w:val="26"/>
+                <w:szCs w:val="26"/>
+              </w:rPr>
+              <w:t>3</w:t>
+            </w:r>
+          </w:p>
+        </w:tc>
+        <w:tc>
+          <w:tcPr>
+            <w:tcW w:w="0" w:type="auto"/>
+            <w:vMerge/>
+            <w:tcBorders>
+              <w:left w:val="single" w:sz="4" w:space="0" w:color="2A2B2C"/>
+              <w:right w:val="single" w:sz="4" w:space="0" w:color="2A2B2C"/>
+            </w:tcBorders>
+            <w:tcMar>
+              <w:top w:w="30" w:type="dxa"/>
+              <w:left w:w="30" w:type="dxa"/>
+              <w:bottom w:w="30" w:type="dxa"/>
+              <w:right w:w="30" w:type="dxa"/>
+            </w:tcMar>
+            <w:vAlign w:val="center"/>
+            <w:hideMark/>
+          </w:tcPr>
+          <w:p>
+            <w:pPr>
+              <w:spacing w:before="80" w:after="220"/>
+              <w:rPr>
+                <w:sz w:val="26"/>
+                <w:szCs w:val="26"/>
+              </w:rPr>
+            </w:pPr>
+          </w:p>
+        </w:tc>
+        <w:tc>
+          <w:tcPr>
+            <w:tcW w:w="0" w:type="auto"/>
+            <w:tcBorders>
+              <w:top w:val="single" w:sz="4" w:space="0" w:color="2A2B2C"/>
+              <w:left w:val="single" w:sz="4" w:space="0" w:color="2A2B2C"/>
+              <w:bottom w:val="single" w:sz="4" w:space="0" w:color="2A2B2C"/>
+              <w:right w:val="single" w:sz="4" w:space="0" w:color="2A2B2C"/>
+            </w:tcBorders>
+            <w:tcMar>
+              <w:top w:w="30" w:type="dxa"/>
+              <w:left w:w="30" w:type="dxa"/>
+              <w:bottom w:w="30" w:type="dxa"/>
+              <w:right w:w="30" w:type="dxa"/>
+            </w:tcMar>
+            <w:vAlign w:val="center"/>
+            <w:hideMark/>
+          </w:tcPr>
+          <w:p>
+            <w:pPr>
+              <w:spacing w:before="80" w:after="220"/>
+              <w:rPr>
+                <w:sz w:val="26"/>
+                <w:szCs w:val="26"/>
+              </w:rPr>
+            </w:pPr>
+            <w:r>
+              <w:rPr>
+                <w:sz w:val="26"/>
+                <w:szCs w:val="26"/>
+              </w:rPr>
+              <w:t xml:space="preserve">nDCG@5 </w:t>
+            </w:r>
+          </w:p>
+        </w:tc>
+        <w:tc>
+          <w:tcPr>
+            <w:tcW w:w="0" w:type="auto"/>
+            <w:tcBorders>
+              <w:top w:val="single" w:sz="4" w:space="0" w:color="2A2B2C"/>
+              <w:left w:val="single" w:sz="4" w:space="0" w:color="2A2B2C"/>
+              <w:bottom w:val="single" w:sz="4" w:space="0" w:color="2A2B2C"/>
+              <w:right w:val="single" w:sz="4" w:space="0" w:color="2A2B2C"/>
+            </w:tcBorders>
+            <w:tcMar>
+              <w:top w:w="30" w:type="dxa"/>
+              <w:left w:w="30" w:type="dxa"/>
+              <w:bottom w:w="30" w:type="dxa"/>
+              <w:right w:w="30" w:type="dxa"/>
+            </w:tcMar>
+            <w:vAlign w:val="center"/>
+            <w:hideMark/>
+          </w:tcPr>
+          <w:p>
+            <w:pPr>
+              <w:spacing w:before="80" w:after="220"/>
+              <w:rPr>
+                <w:sz w:val="26"/>
+                <w:szCs w:val="26"/>
+              </w:rPr>
+            </w:pPr>
+            <w:r>
+              <w:rPr>
+                <w:sz w:val="26"/>
+                <w:szCs w:val="26"/>
+              </w:rPr>
+              <w:t>Code</w:t>
+            </w:r>
+          </w:p>
+        </w:tc>
+        <w:tc>
+          <w:tcPr>
+            <w:tcW w:w="0" w:type="auto"/>
+            <w:tcBorders>
+              <w:top w:val="single" w:sz="4" w:space="0" w:color="2A2B2C"/>
+              <w:left w:val="single" w:sz="4" w:space="0" w:color="2A2B2C"/>
+              <w:bottom w:val="single" w:sz="4" w:space="0" w:color="2A2B2C"/>
+              <w:right w:val="single" w:sz="4" w:space="0" w:color="2A2B2C"/>
+            </w:tcBorders>
+            <w:tcMar>
+              <w:top w:w="30" w:type="dxa"/>
+              <w:left w:w="30" w:type="dxa"/>
+              <w:bottom w:w="30" w:type="dxa"/>
+              <w:right w:w="30" w:type="dxa"/>
+            </w:tcMar>
+            <w:vAlign w:val="center"/>
+            <w:hideMark/>
+          </w:tcPr>
+          <w:p>
+            <w:pPr>
+              <w:spacing w:before="80" w:after="220"/>
+              <w:rPr>
+                <w:sz w:val="26"/>
+                <w:szCs w:val="26"/>
+              </w:rPr>
+            </w:pPr>
+            <w:r>
+              <w:rPr>
+                <w:sz w:val="26"/>
+                <w:szCs w:val="26"/>
+              </w:rPr>
+              <w:t>evidence</w:t>
+            </w:r>
+          </w:p>
+        </w:tc>
+        <w:tc>
+          <w:tcPr>
+            <w:tcW w:w="0" w:type="auto"/>
+            <w:tcBorders>
+              <w:top w:val="single" w:sz="4" w:space="0" w:color="2A2B2C"/>
+              <w:left w:val="single" w:sz="4" w:space="0" w:color="2A2B2C"/>
+              <w:bottom w:val="single" w:sz="4" w:space="0" w:color="2A2B2C"/>
+              <w:right w:val="single" w:sz="4" w:space="0" w:color="2A2B2C"/>
+            </w:tcBorders>
+            <w:tcMar>
+              <w:top w:w="30" w:type="dxa"/>
+              <w:left w:w="30" w:type="dxa"/>
+              <w:bottom w:w="30" w:type="dxa"/>
+              <w:right w:w="30" w:type="dxa"/>
+            </w:tcMar>
+            <w:vAlign w:val="center"/>
+            <w:hideMark/>
+          </w:tcPr>
+          <w:p>
+            <w:pPr>
+              <w:spacing w:before="80" w:after="220"/>
+              <w:rPr>
+                <w:sz w:val="26"/>
+                <w:szCs w:val="26"/>
+              </w:rPr>
+            </w:pPr>
+            <w:r>
+              <w:rPr>
+                <w:sz w:val="26"/>
+                <w:szCs w:val="26"/>
+              </w:rPr>
+              <w:t>Phụ</w:t>
+            </w:r>
+          </w:p>
+        </w:tc>
+      </w:tr>
+      <w:tr>
+        <w:tc>
+          <w:tcPr>
+            <w:tcW w:w="0" w:type="auto"/>
+            <w:tcBorders>
+              <w:top w:val="single" w:sz="4" w:space="0" w:color="2A2B2C"/>
+              <w:left w:val="single" w:sz="4" w:space="0" w:color="2A2B2C"/>
+              <w:bottom w:val="single" w:sz="4" w:space="0" w:color="2A2B2C"/>
+              <w:right w:val="single" w:sz="4" w:space="0" w:color="2A2B2C"/>
+            </w:tcBorders>
+            <w:tcMar>
+              <w:top w:w="30" w:type="dxa"/>
+              <w:left w:w="30" w:type="dxa"/>
+              <w:bottom w:w="30" w:type="dxa"/>
+              <w:right w:w="30" w:type="dxa"/>
+            </w:tcMar>
+            <w:vAlign w:val="center"/>
+            <w:hideMark/>
+          </w:tcPr>
+          <w:p>
+            <w:pPr>
+              <w:spacing w:before="80" w:after="220"/>
+              <w:rPr>
+                <w:sz w:val="26"/>
+                <w:szCs w:val="26"/>
+              </w:rPr>
+            </w:pPr>
+            <w:r>
+              <w:rPr>
+                <w:sz w:val="26"/>
+                <w:szCs w:val="26"/>
+              </w:rPr>
+              <w:t>4</w:t>
+            </w:r>
+          </w:p>
+        </w:tc>
+        <w:tc>
+          <w:tcPr>
+            <w:tcW w:w="0" w:type="auto"/>
+            <w:vMerge/>
+            <w:tcBorders>
+              <w:left w:val="single" w:sz="4" w:space="0" w:color="2A2B2C"/>
+              <w:right w:val="single" w:sz="4" w:space="0" w:color="2A2B2C"/>
+            </w:tcBorders>
+            <w:tcMar>
+              <w:top w:w="30" w:type="dxa"/>
+              <w:left w:w="30" w:type="dxa"/>
+              <w:bottom w:w="30" w:type="dxa"/>
+              <w:right w:w="30" w:type="dxa"/>
+            </w:tcMar>
+            <w:vAlign w:val="center"/>
+            <w:hideMark/>
+          </w:tcPr>
+          <w:p>
+            <w:pPr>
+              <w:spacing w:before="80" w:after="220"/>
+              <w:rPr>
+                <w:sz w:val="26"/>
+                <w:szCs w:val="26"/>
+              </w:rPr>
+            </w:pPr>
+          </w:p>
+        </w:tc>
+        <w:tc>
+          <w:tcPr>
+            <w:tcW w:w="0" w:type="auto"/>
+            <w:tcBorders>
+              <w:top w:val="single" w:sz="4" w:space="0" w:color="2A2B2C"/>
+              <w:left w:val="single" w:sz="4" w:space="0" w:color="2A2B2C"/>
+              <w:bottom w:val="single" w:sz="4" w:space="0" w:color="2A2B2C"/>
+              <w:right w:val="single" w:sz="4" w:space="0" w:color="2A2B2C"/>
+            </w:tcBorders>
+            <w:tcMar>
+              <w:top w:w="30" w:type="dxa"/>
+              <w:left w:w="30" w:type="dxa"/>
+              <w:bottom w:w="30" w:type="dxa"/>
+              <w:right w:w="30" w:type="dxa"/>
+            </w:tcMar>
+            <w:vAlign w:val="center"/>
+            <w:hideMark/>
+          </w:tcPr>
+          <w:p>
+            <w:pPr>
+              <w:spacing w:before="80" w:after="220"/>
+              <w:rPr>
+                <w:sz w:val="26"/>
+                <w:szCs w:val="26"/>
+              </w:rPr>
+            </w:pPr>
+            <w:r>
+              <w:rPr>
+                <w:sz w:val="26"/>
+                <w:szCs w:val="26"/>
+              </w:rPr>
+              <w:t>Context Precision</w:t>
+            </w:r>
+          </w:p>
+        </w:tc>
+        <w:tc>
+          <w:tcPr>
+            <w:tcW w:w="0" w:type="auto"/>
+            <w:tcBorders>
+              <w:top w:val="single" w:sz="4" w:space="0" w:color="2A2B2C"/>
+              <w:left w:val="single" w:sz="4" w:space="0" w:color="2A2B2C"/>
+              <w:bottom w:val="single" w:sz="4" w:space="0" w:color="2A2B2C"/>
+              <w:right w:val="single" w:sz="4" w:space="0" w:color="2A2B2C"/>
+            </w:tcBorders>
+            <w:tcMar>
+              <w:top w:w="30" w:type="dxa"/>
+              <w:left w:w="30" w:type="dxa"/>
+              <w:bottom w:w="30" w:type="dxa"/>
+              <w:right w:w="30" w:type="dxa"/>
+            </w:tcMar>
+            <w:vAlign w:val="center"/>
+            <w:hideMark/>
+          </w:tcPr>
+          <w:p>
+            <w:pPr>
+              <w:spacing w:before="80" w:after="220"/>
+              <w:rPr>
+                <w:sz w:val="26"/>
+                <w:szCs w:val="26"/>
+              </w:rPr>
+            </w:pPr>
+            <w:r>
+              <w:rPr>
+                <w:sz w:val="26"/>
+                <w:szCs w:val="26"/>
+              </w:rPr>
+              <w:t>RAGAS</w:t>
+            </w:r>
+          </w:p>
+        </w:tc>
+        <w:tc>
+          <w:tcPr>
+            <w:tcW w:w="0" w:type="auto"/>
+            <w:tcBorders>
+              <w:top w:val="single" w:sz="4" w:space="0" w:color="2A2B2C"/>
+              <w:left w:val="single" w:sz="4" w:space="0" w:color="2A2B2C"/>
+              <w:bottom w:val="single" w:sz="4" w:space="0" w:color="2A2B2C"/>
+              <w:right w:val="single" w:sz="4" w:space="0" w:color="2A2B2C"/>
+            </w:tcBorders>
+            <w:tcMar>
+              <w:top w:w="30" w:type="dxa"/>
+              <w:left w:w="30" w:type="dxa"/>
+              <w:bottom w:w="30" w:type="dxa"/>
+              <w:right w:w="30" w:type="dxa"/>
+            </w:tcMar>
+            <w:vAlign w:val="center"/>
+            <w:hideMark/>
+          </w:tcPr>
+          <w:p>
+            <w:pPr>
+              <w:spacing w:before="80" w:after="220"/>
+              <w:rPr>
+                <w:sz w:val="26"/>
+                <w:szCs w:val="26"/>
+              </w:rPr>
+            </w:pPr>
+            <w:r>
+              <w:rPr>
+                <w:sz w:val="26"/>
+                <w:szCs w:val="26"/>
+              </w:rPr>
+              <w:t>expected_answer</w:t>
+            </w:r>
+          </w:p>
+        </w:tc>
+        <w:tc>
+          <w:tcPr>
+            <w:tcW w:w="0" w:type="auto"/>
+            <w:tcBorders>
+              <w:top w:val="single" w:sz="4" w:space="0" w:color="2A2B2C"/>
+              <w:left w:val="single" w:sz="4" w:space="0" w:color="2A2B2C"/>
+              <w:bottom w:val="single" w:sz="4" w:space="0" w:color="2A2B2C"/>
+              <w:right w:val="single" w:sz="4" w:space="0" w:color="2A2B2C"/>
+            </w:tcBorders>
+            <w:tcMar>
+              <w:top w:w="30" w:type="dxa"/>
+              <w:left w:w="30" w:type="dxa"/>
+              <w:bottom w:w="30" w:type="dxa"/>
+              <w:right w:w="30" w:type="dxa"/>
+            </w:tcMar>
+            <w:vAlign w:val="center"/>
+            <w:hideMark/>
+          </w:tcPr>
+          <w:p>
+            <w:pPr>
+              <w:spacing w:before="80" w:after="220"/>
+              <w:rPr>
+                <w:sz w:val="26"/>
+                <w:szCs w:val="26"/>
+              </w:rPr>
+            </w:pPr>
+            <w:r>
+              <w:rPr>
+                <w:sz w:val="26"/>
+                <w:szCs w:val="26"/>
+              </w:rPr>
+              <w:t>Phụ: đối chiếu với code</w:t>
+            </w:r>
+          </w:p>
+        </w:tc>
+      </w:tr>
+      <w:tr>
+        <w:tc>
+          <w:tcPr>
+            <w:tcW w:w="0" w:type="auto"/>
+            <w:tcBorders>
+              <w:top w:val="single" w:sz="4" w:space="0" w:color="2A2B2C"/>
+              <w:left w:val="single" w:sz="4" w:space="0" w:color="2A2B2C"/>
+              <w:bottom w:val="single" w:sz="4" w:space="0" w:color="2A2B2C"/>
+              <w:right w:val="single" w:sz="4" w:space="0" w:color="2A2B2C"/>
+            </w:tcBorders>
+            <w:tcMar>
+              <w:top w:w="30" w:type="dxa"/>
+              <w:left w:w="30" w:type="dxa"/>
+              <w:bottom w:w="30" w:type="dxa"/>
+              <w:right w:w="30" w:type="dxa"/>
+            </w:tcMar>
+            <w:vAlign w:val="center"/>
+            <w:hideMark/>
+          </w:tcPr>
+          <w:p>
+            <w:pPr>
+              <w:spacing w:before="80" w:after="220"/>
+              <w:rPr>
+                <w:sz w:val="26"/>
+                <w:szCs w:val="26"/>
+              </w:rPr>
+            </w:pPr>
+            <w:r>
+              <w:rPr>
+                <w:sz w:val="26"/>
+                <w:szCs w:val="26"/>
+              </w:rPr>
+              <w:t>5</w:t>
+            </w:r>
+          </w:p>
+        </w:tc>
+        <w:tc>
+          <w:tcPr>
+            <w:tcW w:w="0" w:type="auto"/>
+            <w:vMerge/>
+            <w:tcBorders>
+              <w:left w:val="single" w:sz="4" w:space="0" w:color="2A2B2C"/>
+              <w:bottom w:val="single" w:sz="4" w:space="0" w:color="2A2B2C"/>
+              <w:right w:val="single" w:sz="4" w:space="0" w:color="2A2B2C"/>
+            </w:tcBorders>
+            <w:tcMar>
+              <w:top w:w="30" w:type="dxa"/>
+              <w:left w:w="30" w:type="dxa"/>
+              <w:bottom w:w="30" w:type="dxa"/>
+              <w:right w:w="30" w:type="dxa"/>
+            </w:tcMar>
+            <w:vAlign w:val="center"/>
+            <w:hideMark/>
+          </w:tcPr>
+          <w:p>
+            <w:pPr>
+              <w:spacing w:before="80" w:after="220"/>
+              <w:rPr>
+                <w:sz w:val="26"/>
+                <w:szCs w:val="26"/>
+              </w:rPr>
+            </w:pPr>
+          </w:p>
+        </w:tc>
+        <w:tc>
+          <w:tcPr>
+            <w:tcW w:w="0" w:type="auto"/>
+            <w:tcBorders>
+              <w:top w:val="single" w:sz="4" w:space="0" w:color="2A2B2C"/>
+              <w:left w:val="single" w:sz="4" w:space="0" w:color="2A2B2C"/>
+              <w:bottom w:val="single" w:sz="4" w:space="0" w:color="2A2B2C"/>
+              <w:right w:val="single" w:sz="4" w:space="0" w:color="2A2B2C"/>
+            </w:tcBorders>
+            <w:tcMar>
+              <w:top w:w="30" w:type="dxa"/>
+              <w:left w:w="30" w:type="dxa"/>
+              <w:bottom w:w="30" w:type="dxa"/>
+              <w:right w:w="30" w:type="dxa"/>
+            </w:tcMar>
+            <w:vAlign w:val="center"/>
+            <w:hideMark/>
+          </w:tcPr>
+          <w:p>
+            <w:pPr>
+              <w:spacing w:before="80" w:after="220"/>
+              <w:rPr>
+                <w:sz w:val="26"/>
+                <w:szCs w:val="26"/>
+              </w:rPr>
+            </w:pPr>
+            <w:r>
+              <w:rPr>
+                <w:sz w:val="26"/>
+                <w:szCs w:val="26"/>
+              </w:rPr>
+              <w:t>Context Recall</w:t>
+            </w:r>
+          </w:p>
+        </w:tc>
+        <w:tc>
+          <w:tcPr>
+            <w:tcW w:w="0" w:type="auto"/>
+            <w:tcBorders>
+              <w:top w:val="single" w:sz="4" w:space="0" w:color="2A2B2C"/>
+              <w:left w:val="single" w:sz="4" w:space="0" w:color="2A2B2C"/>
+              <w:bottom w:val="single" w:sz="4" w:space="0" w:color="2A2B2C"/>
+              <w:right w:val="single" w:sz="4" w:space="0" w:color="2A2B2C"/>
+            </w:tcBorders>
+            <w:tcMar>
+              <w:top w:w="30" w:type="dxa"/>
+              <w:left w:w="30" w:type="dxa"/>
+              <w:bottom w:w="30" w:type="dxa"/>
+              <w:right w:w="30" w:type="dxa"/>
+            </w:tcMar>
+            <w:vAlign w:val="center"/>
+            <w:hideMark/>
+          </w:tcPr>
+          <w:p>
+            <w:pPr>
+              <w:spacing w:before="80" w:after="220"/>
+              <w:rPr>
+                <w:sz w:val="26"/>
+                <w:szCs w:val="26"/>
+              </w:rPr>
+            </w:pPr>
+            <w:r>
+              <w:rPr>
+                <w:sz w:val="26"/>
+                <w:szCs w:val="26"/>
+              </w:rPr>
+              <w:t>RAGAS</w:t>
+            </w:r>
+          </w:p>
+        </w:tc>
+        <w:tc>
+          <w:tcPr>
+            <w:tcW w:w="0" w:type="auto"/>
+            <w:tcBorders>
+              <w:top w:val="single" w:sz="4" w:space="0" w:color="2A2B2C"/>
+              <w:left w:val="single" w:sz="4" w:space="0" w:color="2A2B2C"/>
+              <w:bottom w:val="single" w:sz="4" w:space="0" w:color="2A2B2C"/>
+              <w:right w:val="single" w:sz="4" w:space="0" w:color="2A2B2C"/>
+            </w:tcBorders>
+            <w:tcMar>
+              <w:top w:w="30" w:type="dxa"/>
+              <w:left w:w="30" w:type="dxa"/>
+              <w:bottom w:w="30" w:type="dxa"/>
+              <w:right w:w="30" w:type="dxa"/>
+            </w:tcMar>
+            <w:vAlign w:val="center"/>
+            <w:hideMark/>
+          </w:tcPr>
+          <w:p>
+            <w:pPr>
+              <w:spacing w:before="80" w:after="220"/>
+              <w:rPr>
+                <w:sz w:val="26"/>
+                <w:szCs w:val="26"/>
+              </w:rPr>
+            </w:pPr>
+            <w:r>
+              <w:rPr>
+                <w:sz w:val="26"/>
+                <w:szCs w:val="26"/>
+              </w:rPr>
+              <w:t>expected_answer</w:t>
+            </w:r>
+          </w:p>
+        </w:tc>
+        <w:tc>
+          <w:tcPr>
+            <w:tcW w:w="0" w:type="auto"/>
+            <w:tcBorders>
+              <w:top w:val="single" w:sz="4" w:space="0" w:color="2A2B2C"/>
+              <w:left w:val="single" w:sz="4" w:space="0" w:color="2A2B2C"/>
+              <w:bottom w:val="single" w:sz="4" w:space="0" w:color="2A2B2C"/>
+              <w:right w:val="single" w:sz="4" w:space="0" w:color="2A2B2C"/>
+            </w:tcBorders>
+            <w:tcMar>
+              <w:top w:w="30" w:type="dxa"/>
+              <w:left w:w="30" w:type="dxa"/>
+              <w:bottom w:w="30" w:type="dxa"/>
+              <w:right w:w="30" w:type="dxa"/>
+            </w:tcMar>
+            <w:vAlign w:val="center"/>
+            <w:hideMark/>
+          </w:tcPr>
+          <w:p>
+            <w:pPr>
+              <w:spacing w:before="80" w:after="220"/>
+              <w:rPr>
+                <w:sz w:val="26"/>
+                <w:szCs w:val="26"/>
+              </w:rPr>
+            </w:pPr>
+            <w:r>
+              <w:rPr>
+                <w:sz w:val="26"/>
+                <w:szCs w:val="26"/>
+              </w:rPr>
+              <w:t>Phụ: đối chiếu với code</w:t>
+            </w:r>
+          </w:p>
+        </w:tc>
+      </w:tr>
+      <w:tr>
+        <w:tc>
+          <w:tcPr>
+            <w:tcW w:w="0" w:type="auto"/>
+            <w:tcBorders>
+              <w:top w:val="single" w:sz="4" w:space="0" w:color="2A2B2C"/>
+              <w:left w:val="single" w:sz="4" w:space="0" w:color="2A2B2C"/>
+              <w:bottom w:val="single" w:sz="4" w:space="0" w:color="2A2B2C"/>
+              <w:right w:val="single" w:sz="4" w:space="0" w:color="2A2B2C"/>
+            </w:tcBorders>
+            <w:tcMar>
+              <w:top w:w="30" w:type="dxa"/>
+              <w:left w:w="30" w:type="dxa"/>
+              <w:bottom w:w="30" w:type="dxa"/>
+              <w:right w:w="30" w:type="dxa"/>
+            </w:tcMar>
+            <w:vAlign w:val="center"/>
+            <w:hideMark/>
+          </w:tcPr>
+          <w:p>
+            <w:pPr>
+              <w:spacing w:before="80" w:after="220"/>
+              <w:rPr>
+                <w:sz w:val="26"/>
+                <w:szCs w:val="26"/>
+              </w:rPr>
+            </w:pPr>
+            <w:r>
+              <w:rPr>
+                <w:sz w:val="26"/>
+                <w:szCs w:val="26"/>
+              </w:rPr>
+              <w:t>6</w:t>
+            </w:r>
+          </w:p>
+        </w:tc>
         <w:tc>
           <w:tcPr>
             <w:tcW w:w="0" w:type="auto"/>
             <w:vMerge w:val="restart"/>
+            <w:tcBorders>
+              <w:top w:val="single" w:sz="4" w:space="0" w:color="2A2B2C"/>
+              <w:left w:val="single" w:sz="4" w:space="0" w:color="2A2B2C"/>
+              <w:right w:val="single" w:sz="4" w:space="0" w:color="2A2B2C"/>
+            </w:tcBorders>
+            <w:tcMar>
+              <w:top w:w="30" w:type="dxa"/>
+              <w:left w:w="30" w:type="dxa"/>
+              <w:bottom w:w="30" w:type="dxa"/>
+              <w:right w:w="30" w:type="dxa"/>
+            </w:tcMar>
             <w:vAlign w:val="center"/>
             <w:hideMark/>
           </w:tcPr>
           <w:p>
             <w:pPr>
               <w:spacing w:before="80" w:after="220"/>
-              <w:jc w:val="center"/>
               <w:rPr>
                 <w:sz w:val="26"/>
                 <w:szCs w:val="26"/>
@@ -38835,98 +39990,218 @@
                 <w:sz w:val="26"/>
                 <w:szCs w:val="26"/>
               </w:rPr>
-              <w:t>2. Đáp án</w:t>
+              <w:t>Answer Correctness</w:t>
             </w:r>
           </w:p>
         </w:tc>
         <w:tc>
           <w:tcPr>
             <w:tcW w:w="0" w:type="auto"/>
+            <w:tcBorders>
+              <w:top w:val="single" w:sz="4" w:space="0" w:color="2A2B2C"/>
+              <w:left w:val="single" w:sz="4" w:space="0" w:color="2A2B2C"/>
+              <w:bottom w:val="single" w:sz="4" w:space="0" w:color="2A2B2C"/>
+              <w:right w:val="single" w:sz="4" w:space="0" w:color="2A2B2C"/>
+            </w:tcBorders>
+            <w:shd w:val="clear" w:color="auto" w:fill="B3E5A1" w:themeFill="accent6" w:themeFillTint="66"/>
+            <w:tcMar>
+              <w:top w:w="30" w:type="dxa"/>
+              <w:left w:w="30" w:type="dxa"/>
+              <w:bottom w:w="30" w:type="dxa"/>
+              <w:right w:w="30" w:type="dxa"/>
+            </w:tcMar>
             <w:vAlign w:val="center"/>
             <w:hideMark/>
           </w:tcPr>
           <w:p>
             <w:pPr>
               <w:spacing w:before="80" w:after="220"/>
-              <w:jc w:val="center"/>
-              <w:rPr>
-                <w:sz w:val="26"/>
-                <w:szCs w:val="26"/>
-              </w:rPr>
-            </w:pPr>
-            <w:r>
-              <w:rPr>
-                <w:sz w:val="26"/>
-                <w:szCs w:val="26"/>
-              </w:rPr>
-              <w:t>Khớp chính xác cho dữ kiện số; độ phủ ý chính cho câu trả lời tự do</w:t>
+              <w:rPr>
+                <w:sz w:val="26"/>
+                <w:szCs w:val="26"/>
+              </w:rPr>
+            </w:pPr>
+            <w:r>
+              <w:rPr>
+                <w:b/>
+                <w:bCs/>
+                <w:sz w:val="26"/>
+                <w:szCs w:val="26"/>
+              </w:rPr>
+              <w:t>Factual Correctness</w:t>
             </w:r>
           </w:p>
         </w:tc>
         <w:tc>
           <w:tcPr>
             <w:tcW w:w="0" w:type="auto"/>
+            <w:tcBorders>
+              <w:top w:val="single" w:sz="4" w:space="0" w:color="2A2B2C"/>
+              <w:left w:val="single" w:sz="4" w:space="0" w:color="2A2B2C"/>
+              <w:bottom w:val="single" w:sz="4" w:space="0" w:color="2A2B2C"/>
+              <w:right w:val="single" w:sz="4" w:space="0" w:color="2A2B2C"/>
+            </w:tcBorders>
+            <w:tcMar>
+              <w:top w:w="30" w:type="dxa"/>
+              <w:left w:w="30" w:type="dxa"/>
+              <w:bottom w:w="30" w:type="dxa"/>
+              <w:right w:w="30" w:type="dxa"/>
+            </w:tcMar>
             <w:vAlign w:val="center"/>
             <w:hideMark/>
           </w:tcPr>
           <w:p>
             <w:pPr>
               <w:spacing w:before="80" w:after="220"/>
-              <w:jc w:val="center"/>
-              <w:rPr>
-                <w:sz w:val="26"/>
-                <w:szCs w:val="26"/>
-              </w:rPr>
-            </w:pPr>
-            <w:r>
-              <w:rPr>
-                <w:sz w:val="26"/>
-                <w:szCs w:val="26"/>
-              </w:rPr>
-              <w:t>Chuẩn hóa số rồi so sánh; đếm số ý chính có mặt</w:t>
+              <w:rPr>
+                <w:sz w:val="26"/>
+                <w:szCs w:val="26"/>
+              </w:rPr>
+            </w:pPr>
+            <w:r>
+              <w:rPr>
+                <w:sz w:val="26"/>
+                <w:szCs w:val="26"/>
+              </w:rPr>
+              <w:t>RAGAS</w:t>
             </w:r>
           </w:p>
         </w:tc>
         <w:tc>
           <w:tcPr>
             <w:tcW w:w="0" w:type="auto"/>
+            <w:tcBorders>
+              <w:top w:val="single" w:sz="4" w:space="0" w:color="2A2B2C"/>
+              <w:left w:val="single" w:sz="4" w:space="0" w:color="2A2B2C"/>
+              <w:bottom w:val="single" w:sz="4" w:space="0" w:color="2A2B2C"/>
+              <w:right w:val="single" w:sz="4" w:space="0" w:color="2A2B2C"/>
+            </w:tcBorders>
+            <w:tcMar>
+              <w:top w:w="30" w:type="dxa"/>
+              <w:left w:w="30" w:type="dxa"/>
+              <w:bottom w:w="30" w:type="dxa"/>
+              <w:right w:w="30" w:type="dxa"/>
+            </w:tcMar>
             <w:vAlign w:val="center"/>
             <w:hideMark/>
           </w:tcPr>
           <w:p>
             <w:pPr>
               <w:spacing w:before="80" w:after="220"/>
-              <w:jc w:val="center"/>
-              <w:rPr>
-                <w:sz w:val="26"/>
-                <w:szCs w:val="26"/>
-              </w:rPr>
-            </w:pPr>
-            <w:r>
-              <w:rPr>
-                <w:sz w:val="26"/>
-                <w:szCs w:val="26"/>
-              </w:rPr>
-              <w:t>Chỉ câu tự do</w:t>
+              <w:rPr>
+                <w:sz w:val="26"/>
+                <w:szCs w:val="26"/>
+              </w:rPr>
+            </w:pPr>
+            <w:r>
+              <w:rPr>
+                <w:sz w:val="26"/>
+                <w:szCs w:val="26"/>
+              </w:rPr>
+              <w:t>expected_answer</w:t>
+            </w:r>
+          </w:p>
+        </w:tc>
+        <w:tc>
+          <w:tcPr>
+            <w:tcW w:w="0" w:type="auto"/>
+            <w:tcBorders>
+              <w:top w:val="single" w:sz="4" w:space="0" w:color="2A2B2C"/>
+              <w:left w:val="single" w:sz="4" w:space="0" w:color="2A2B2C"/>
+              <w:bottom w:val="single" w:sz="4" w:space="0" w:color="2A2B2C"/>
+              <w:right w:val="single" w:sz="4" w:space="0" w:color="2A2B2C"/>
+            </w:tcBorders>
+            <w:tcMar>
+              <w:top w:w="30" w:type="dxa"/>
+              <w:left w:w="30" w:type="dxa"/>
+              <w:bottom w:w="30" w:type="dxa"/>
+              <w:right w:w="30" w:type="dxa"/>
+            </w:tcMar>
+            <w:vAlign w:val="center"/>
+            <w:hideMark/>
+          </w:tcPr>
+          <w:p>
+            <w:pPr>
+              <w:spacing w:before="80" w:after="220"/>
+              <w:rPr>
+                <w:sz w:val="26"/>
+                <w:szCs w:val="26"/>
+              </w:rPr>
+            </w:pPr>
+            <w:r>
+              <w:rPr>
+                <w:rFonts w:ascii="Segoe UI Emoji" w:hAnsi="Segoe UI Emoji" w:cs="Segoe UI Emoji"/>
+                <w:sz w:val="26"/>
+                <w:szCs w:val="26"/>
+              </w:rPr>
+              <w:t>⭐</w:t>
+            </w:r>
+            <w:r>
+              <w:rPr>
+                <w:sz w:val="26"/>
+                <w:szCs w:val="26"/>
+              </w:rPr>
+              <w:t xml:space="preserve"> Chính</w:t>
             </w:r>
           </w:p>
         </w:tc>
       </w:tr>
       <w:tr>
-        <w:trPr>
-          <w:tblCellSpacing w:w="15" w:type="dxa"/>
-        </w:trPr>
+        <w:tc>
+          <w:tcPr>
+            <w:tcW w:w="0" w:type="auto"/>
+            <w:tcBorders>
+              <w:top w:val="single" w:sz="4" w:space="0" w:color="2A2B2C"/>
+              <w:left w:val="single" w:sz="4" w:space="0" w:color="2A2B2C"/>
+              <w:bottom w:val="single" w:sz="4" w:space="0" w:color="2A2B2C"/>
+              <w:right w:val="single" w:sz="4" w:space="0" w:color="2A2B2C"/>
+            </w:tcBorders>
+            <w:tcMar>
+              <w:top w:w="30" w:type="dxa"/>
+              <w:left w:w="30" w:type="dxa"/>
+              <w:bottom w:w="30" w:type="dxa"/>
+              <w:right w:w="30" w:type="dxa"/>
+            </w:tcMar>
+            <w:vAlign w:val="center"/>
+            <w:hideMark/>
+          </w:tcPr>
+          <w:p>
+            <w:pPr>
+              <w:spacing w:before="80" w:after="220"/>
+              <w:rPr>
+                <w:sz w:val="26"/>
+                <w:szCs w:val="26"/>
+              </w:rPr>
+            </w:pPr>
+            <w:r>
+              <w:rPr>
+                <w:sz w:val="26"/>
+                <w:szCs w:val="26"/>
+              </w:rPr>
+              <w:t>7</w:t>
+            </w:r>
+          </w:p>
+        </w:tc>
         <w:tc>
           <w:tcPr>
             <w:tcW w:w="0" w:type="auto"/>
             <w:vMerge/>
+            <w:tcBorders>
+              <w:left w:val="single" w:sz="4" w:space="0" w:color="2A2B2C"/>
+              <w:right w:val="single" w:sz="4" w:space="0" w:color="2A2B2C"/>
+            </w:tcBorders>
+            <w:tcMar>
+              <w:top w:w="30" w:type="dxa"/>
+              <w:left w:w="30" w:type="dxa"/>
+              <w:bottom w:w="30" w:type="dxa"/>
+              <w:right w:w="30" w:type="dxa"/>
+            </w:tcMar>
             <w:vAlign w:val="center"/>
             <w:hideMark/>
           </w:tcPr>
           <w:p>
             <w:pPr>
               <w:spacing w:before="80" w:after="220"/>
-              <w:jc w:val="center"/>
               <w:rPr>
                 <w:sz w:val="26"/>
                 <w:szCs w:val="26"/>
@@ -38937,91 +40212,406 @@
         <w:tc>
           <w:tcPr>
             <w:tcW w:w="0" w:type="auto"/>
+            <w:tcBorders>
+              <w:top w:val="single" w:sz="4" w:space="0" w:color="2A2B2C"/>
+              <w:left w:val="single" w:sz="4" w:space="0" w:color="2A2B2C"/>
+              <w:bottom w:val="single" w:sz="4" w:space="0" w:color="2A2B2C"/>
+              <w:right w:val="single" w:sz="4" w:space="0" w:color="2A2B2C"/>
+            </w:tcBorders>
+            <w:tcMar>
+              <w:top w:w="30" w:type="dxa"/>
+              <w:left w:w="30" w:type="dxa"/>
+              <w:bottom w:w="30" w:type="dxa"/>
+              <w:right w:w="30" w:type="dxa"/>
+            </w:tcMar>
             <w:vAlign w:val="center"/>
             <w:hideMark/>
           </w:tcPr>
           <w:p>
             <w:pPr>
               <w:spacing w:before="80" w:after="220"/>
-              <w:jc w:val="center"/>
-              <w:rPr>
-                <w:sz w:val="26"/>
-                <w:szCs w:val="26"/>
-              </w:rPr>
-            </w:pPr>
-            <w:r>
-              <w:rPr>
-                <w:sz w:val="26"/>
-                <w:szCs w:val="26"/>
-              </w:rPr>
-              <w:t>Độ chính xác từ chối; tỉ lệ từ chối nhầm</w:t>
+              <w:rPr>
+                <w:sz w:val="26"/>
+                <w:szCs w:val="26"/>
+              </w:rPr>
+            </w:pPr>
+            <w:r>
+              <w:rPr>
+                <w:sz w:val="26"/>
+                <w:szCs w:val="26"/>
+              </w:rPr>
+              <w:t>Semantic Similarity</w:t>
             </w:r>
           </w:p>
         </w:tc>
         <w:tc>
           <w:tcPr>
             <w:tcW w:w="0" w:type="auto"/>
+            <w:tcBorders>
+              <w:top w:val="single" w:sz="4" w:space="0" w:color="2A2B2C"/>
+              <w:left w:val="single" w:sz="4" w:space="0" w:color="2A2B2C"/>
+              <w:bottom w:val="single" w:sz="4" w:space="0" w:color="2A2B2C"/>
+              <w:right w:val="single" w:sz="4" w:space="0" w:color="2A2B2C"/>
+            </w:tcBorders>
+            <w:tcMar>
+              <w:top w:w="30" w:type="dxa"/>
+              <w:left w:w="30" w:type="dxa"/>
+              <w:bottom w:w="30" w:type="dxa"/>
+              <w:right w:w="30" w:type="dxa"/>
+            </w:tcMar>
             <w:vAlign w:val="center"/>
             <w:hideMark/>
           </w:tcPr>
           <w:p>
             <w:pPr>
               <w:spacing w:before="80" w:after="220"/>
-              <w:jc w:val="center"/>
-              <w:rPr>
-                <w:sz w:val="26"/>
-                <w:szCs w:val="26"/>
-              </w:rPr>
-            </w:pPr>
-            <w:r>
-              <w:rPr>
-                <w:sz w:val="26"/>
-                <w:szCs w:val="26"/>
-              </w:rPr>
-              <w:t>Trên nhóm câu không có đáp án và nhóm có đáp án</w:t>
+              <w:rPr>
+                <w:sz w:val="26"/>
+                <w:szCs w:val="26"/>
+              </w:rPr>
+            </w:pPr>
+            <w:r>
+              <w:rPr>
+                <w:sz w:val="26"/>
+                <w:szCs w:val="26"/>
+              </w:rPr>
+              <w:t>RAGAS (chỉ embedding)</w:t>
             </w:r>
           </w:p>
         </w:tc>
         <w:tc>
           <w:tcPr>
             <w:tcW w:w="0" w:type="auto"/>
+            <w:tcBorders>
+              <w:top w:val="single" w:sz="4" w:space="0" w:color="2A2B2C"/>
+              <w:left w:val="single" w:sz="4" w:space="0" w:color="2A2B2C"/>
+              <w:bottom w:val="single" w:sz="4" w:space="0" w:color="2A2B2C"/>
+              <w:right w:val="single" w:sz="4" w:space="0" w:color="2A2B2C"/>
+            </w:tcBorders>
+            <w:tcMar>
+              <w:top w:w="30" w:type="dxa"/>
+              <w:left w:w="30" w:type="dxa"/>
+              <w:bottom w:w="30" w:type="dxa"/>
+              <w:right w:w="30" w:type="dxa"/>
+            </w:tcMar>
             <w:vAlign w:val="center"/>
             <w:hideMark/>
           </w:tcPr>
           <w:p>
             <w:pPr>
               <w:spacing w:before="80" w:after="220"/>
-              <w:jc w:val="center"/>
-              <w:rPr>
-                <w:sz w:val="26"/>
-                <w:szCs w:val="26"/>
-              </w:rPr>
-            </w:pPr>
-            <w:r>
-              <w:rPr>
-                <w:sz w:val="26"/>
-                <w:szCs w:val="26"/>
-              </w:rPr>
-              <w:t>Không</w:t>
+              <w:rPr>
+                <w:sz w:val="26"/>
+                <w:szCs w:val="26"/>
+              </w:rPr>
+            </w:pPr>
+            <w:r>
+              <w:rPr>
+                <w:sz w:val="26"/>
+                <w:szCs w:val="26"/>
+              </w:rPr>
+              <w:t>expected_answer</w:t>
+            </w:r>
+          </w:p>
+        </w:tc>
+        <w:tc>
+          <w:tcPr>
+            <w:tcW w:w="0" w:type="auto"/>
+            <w:tcBorders>
+              <w:top w:val="single" w:sz="4" w:space="0" w:color="2A2B2C"/>
+              <w:left w:val="single" w:sz="4" w:space="0" w:color="2A2B2C"/>
+              <w:bottom w:val="single" w:sz="4" w:space="0" w:color="2A2B2C"/>
+              <w:right w:val="single" w:sz="4" w:space="0" w:color="2A2B2C"/>
+            </w:tcBorders>
+            <w:tcMar>
+              <w:top w:w="30" w:type="dxa"/>
+              <w:left w:w="30" w:type="dxa"/>
+              <w:bottom w:w="30" w:type="dxa"/>
+              <w:right w:w="30" w:type="dxa"/>
+            </w:tcMar>
+            <w:vAlign w:val="center"/>
+            <w:hideMark/>
+          </w:tcPr>
+          <w:p>
+            <w:pPr>
+              <w:spacing w:before="80" w:after="220"/>
+              <w:rPr>
+                <w:sz w:val="26"/>
+                <w:szCs w:val="26"/>
+              </w:rPr>
+            </w:pPr>
+            <w:r>
+              <w:rPr>
+                <w:sz w:val="26"/>
+                <w:szCs w:val="26"/>
+              </w:rPr>
+              <w:t>Phụ: tham khảo</w:t>
             </w:r>
           </w:p>
         </w:tc>
       </w:tr>
       <w:tr>
-        <w:trPr>
-          <w:tblCellSpacing w:w="15" w:type="dxa"/>
-        </w:trPr>
+        <w:tc>
+          <w:tcPr>
+            <w:tcW w:w="0" w:type="auto"/>
+            <w:tcBorders>
+              <w:top w:val="single" w:sz="4" w:space="0" w:color="2A2B2C"/>
+              <w:left w:val="single" w:sz="4" w:space="0" w:color="2A2B2C"/>
+              <w:bottom w:val="single" w:sz="4" w:space="0" w:color="2A2B2C"/>
+              <w:right w:val="single" w:sz="4" w:space="0" w:color="2A2B2C"/>
+            </w:tcBorders>
+            <w:tcMar>
+              <w:top w:w="30" w:type="dxa"/>
+              <w:left w:w="30" w:type="dxa"/>
+              <w:bottom w:w="30" w:type="dxa"/>
+              <w:right w:w="30" w:type="dxa"/>
+            </w:tcMar>
+            <w:vAlign w:val="center"/>
+            <w:hideMark/>
+          </w:tcPr>
+          <w:p>
+            <w:pPr>
+              <w:spacing w:before="80" w:after="220"/>
+              <w:rPr>
+                <w:sz w:val="26"/>
+                <w:szCs w:val="26"/>
+              </w:rPr>
+            </w:pPr>
+            <w:r>
+              <w:rPr>
+                <w:sz w:val="26"/>
+                <w:szCs w:val="26"/>
+              </w:rPr>
+              <w:t>8</w:t>
+            </w:r>
+          </w:p>
+        </w:tc>
+        <w:tc>
+          <w:tcPr>
+            <w:tcW w:w="0" w:type="auto"/>
+            <w:vMerge/>
+            <w:tcBorders>
+              <w:left w:val="single" w:sz="4" w:space="0" w:color="2A2B2C"/>
+              <w:bottom w:val="single" w:sz="4" w:space="0" w:color="2A2B2C"/>
+              <w:right w:val="single" w:sz="4" w:space="0" w:color="2A2B2C"/>
+            </w:tcBorders>
+            <w:tcMar>
+              <w:top w:w="30" w:type="dxa"/>
+              <w:left w:w="30" w:type="dxa"/>
+              <w:bottom w:w="30" w:type="dxa"/>
+              <w:right w:w="30" w:type="dxa"/>
+            </w:tcMar>
+            <w:vAlign w:val="center"/>
+            <w:hideMark/>
+          </w:tcPr>
+          <w:p>
+            <w:pPr>
+              <w:spacing w:before="80" w:after="220"/>
+              <w:rPr>
+                <w:sz w:val="26"/>
+                <w:szCs w:val="26"/>
+              </w:rPr>
+            </w:pPr>
+          </w:p>
+        </w:tc>
+        <w:tc>
+          <w:tcPr>
+            <w:tcW w:w="0" w:type="auto"/>
+            <w:tcBorders>
+              <w:top w:val="single" w:sz="4" w:space="0" w:color="2A2B2C"/>
+              <w:left w:val="single" w:sz="4" w:space="0" w:color="2A2B2C"/>
+              <w:bottom w:val="single" w:sz="4" w:space="0" w:color="2A2B2C"/>
+              <w:right w:val="single" w:sz="4" w:space="0" w:color="2A2B2C"/>
+            </w:tcBorders>
+            <w:tcMar>
+              <w:top w:w="30" w:type="dxa"/>
+              <w:left w:w="30" w:type="dxa"/>
+              <w:bottom w:w="30" w:type="dxa"/>
+              <w:right w:w="30" w:type="dxa"/>
+            </w:tcMar>
+            <w:vAlign w:val="center"/>
+            <w:hideMark/>
+          </w:tcPr>
+          <w:p>
+            <w:pPr>
+              <w:spacing w:before="80" w:after="220"/>
+              <w:rPr>
+                <w:sz w:val="26"/>
+                <w:szCs w:val="26"/>
+              </w:rPr>
+            </w:pPr>
+            <w:r>
+              <w:rPr>
+                <w:sz w:val="26"/>
+                <w:szCs w:val="26"/>
+              </w:rPr>
+              <w:t>Number Match</w:t>
+            </w:r>
+          </w:p>
+        </w:tc>
+        <w:tc>
+          <w:tcPr>
+            <w:tcW w:w="0" w:type="auto"/>
+            <w:tcBorders>
+              <w:top w:val="single" w:sz="4" w:space="0" w:color="2A2B2C"/>
+              <w:left w:val="single" w:sz="4" w:space="0" w:color="2A2B2C"/>
+              <w:bottom w:val="single" w:sz="4" w:space="0" w:color="2A2B2C"/>
+              <w:right w:val="single" w:sz="4" w:space="0" w:color="2A2B2C"/>
+            </w:tcBorders>
+            <w:tcMar>
+              <w:top w:w="30" w:type="dxa"/>
+              <w:left w:w="30" w:type="dxa"/>
+              <w:bottom w:w="30" w:type="dxa"/>
+              <w:right w:w="30" w:type="dxa"/>
+            </w:tcMar>
+            <w:vAlign w:val="center"/>
+            <w:hideMark/>
+          </w:tcPr>
+          <w:p>
+            <w:pPr>
+              <w:spacing w:before="80" w:after="220"/>
+              <w:rPr>
+                <w:sz w:val="26"/>
+                <w:szCs w:val="26"/>
+              </w:rPr>
+            </w:pPr>
+            <w:r>
+              <w:rPr>
+                <w:sz w:val="26"/>
+                <w:szCs w:val="26"/>
+              </w:rPr>
+              <w:t>Code</w:t>
+            </w:r>
+          </w:p>
+        </w:tc>
+        <w:tc>
+          <w:tcPr>
+            <w:tcW w:w="0" w:type="auto"/>
+            <w:tcBorders>
+              <w:top w:val="single" w:sz="4" w:space="0" w:color="2A2B2C"/>
+              <w:left w:val="single" w:sz="4" w:space="0" w:color="2A2B2C"/>
+              <w:bottom w:val="single" w:sz="4" w:space="0" w:color="2A2B2C"/>
+              <w:right w:val="single" w:sz="4" w:space="0" w:color="2A2B2C"/>
+            </w:tcBorders>
+            <w:tcMar>
+              <w:top w:w="30" w:type="dxa"/>
+              <w:left w:w="30" w:type="dxa"/>
+              <w:bottom w:w="30" w:type="dxa"/>
+              <w:right w:w="30" w:type="dxa"/>
+            </w:tcMar>
+            <w:vAlign w:val="center"/>
+            <w:hideMark/>
+          </w:tcPr>
+          <w:p>
+            <w:pPr>
+              <w:spacing w:before="80" w:after="220"/>
+              <w:rPr>
+                <w:sz w:val="26"/>
+                <w:szCs w:val="26"/>
+              </w:rPr>
+            </w:pPr>
+            <w:r>
+              <w:rPr>
+                <w:sz w:val="26"/>
+                <w:szCs w:val="26"/>
+              </w:rPr>
+              <w:t>key_points</w:t>
+            </w:r>
+          </w:p>
+        </w:tc>
+        <w:tc>
+          <w:tcPr>
+            <w:tcW w:w="0" w:type="auto"/>
+            <w:tcBorders>
+              <w:top w:val="single" w:sz="4" w:space="0" w:color="2A2B2C"/>
+              <w:left w:val="single" w:sz="4" w:space="0" w:color="2A2B2C"/>
+              <w:bottom w:val="single" w:sz="4" w:space="0" w:color="2A2B2C"/>
+              <w:right w:val="single" w:sz="4" w:space="0" w:color="2A2B2C"/>
+            </w:tcBorders>
+            <w:tcMar>
+              <w:top w:w="30" w:type="dxa"/>
+              <w:left w:w="30" w:type="dxa"/>
+              <w:bottom w:w="30" w:type="dxa"/>
+              <w:right w:w="30" w:type="dxa"/>
+            </w:tcMar>
+            <w:vAlign w:val="center"/>
+            <w:hideMark/>
+          </w:tcPr>
+          <w:p>
+            <w:pPr>
+              <w:spacing w:before="80" w:after="220"/>
+              <w:rPr>
+                <w:sz w:val="26"/>
+                <w:szCs w:val="26"/>
+              </w:rPr>
+            </w:pPr>
+            <w:r>
+              <w:rPr>
+                <w:sz w:val="26"/>
+                <w:szCs w:val="26"/>
+              </w:rPr>
+              <w:t>Phụ</w:t>
+            </w:r>
+          </w:p>
+        </w:tc>
+      </w:tr>
+      <w:tr>
+        <w:tc>
+          <w:tcPr>
+            <w:tcW w:w="0" w:type="auto"/>
+            <w:tcBorders>
+              <w:top w:val="single" w:sz="4" w:space="0" w:color="2A2B2C"/>
+              <w:left w:val="single" w:sz="4" w:space="0" w:color="2A2B2C"/>
+              <w:bottom w:val="single" w:sz="4" w:space="0" w:color="2A2B2C"/>
+              <w:right w:val="single" w:sz="4" w:space="0" w:color="2A2B2C"/>
+            </w:tcBorders>
+            <w:tcMar>
+              <w:top w:w="30" w:type="dxa"/>
+              <w:left w:w="30" w:type="dxa"/>
+              <w:bottom w:w="30" w:type="dxa"/>
+              <w:right w:w="30" w:type="dxa"/>
+            </w:tcMar>
+            <w:vAlign w:val="center"/>
+            <w:hideMark/>
+          </w:tcPr>
+          <w:p>
+            <w:pPr>
+              <w:spacing w:before="80" w:after="220"/>
+              <w:rPr>
+                <w:sz w:val="26"/>
+                <w:szCs w:val="26"/>
+              </w:rPr>
+            </w:pPr>
+            <w:r>
+              <w:rPr>
+                <w:sz w:val="26"/>
+                <w:szCs w:val="26"/>
+              </w:rPr>
+              <w:t>9</w:t>
+            </w:r>
+          </w:p>
+        </w:tc>
         <w:tc>
           <w:tcPr>
             <w:tcW w:w="0" w:type="auto"/>
             <w:vMerge w:val="restart"/>
+            <w:tcBorders>
+              <w:top w:val="single" w:sz="4" w:space="0" w:color="2A2B2C"/>
+              <w:left w:val="single" w:sz="4" w:space="0" w:color="2A2B2C"/>
+              <w:right w:val="single" w:sz="4" w:space="0" w:color="2A2B2C"/>
+            </w:tcBorders>
+            <w:tcMar>
+              <w:top w:w="30" w:type="dxa"/>
+              <w:left w:w="30" w:type="dxa"/>
+              <w:bottom w:w="30" w:type="dxa"/>
+              <w:right w:w="30" w:type="dxa"/>
+            </w:tcMar>
             <w:vAlign w:val="center"/>
             <w:hideMark/>
           </w:tcPr>
           <w:p>
             <w:pPr>
               <w:spacing w:before="80" w:after="220"/>
-              <w:jc w:val="center"/>
               <w:rPr>
                 <w:sz w:val="26"/>
                 <w:szCs w:val="26"/>
@@ -39034,98 +40624,218 @@
                 <w:sz w:val="26"/>
                 <w:szCs w:val="26"/>
               </w:rPr>
-              <w:t>3. Trích dẫn</w:t>
+              <w:t>Grounding &amp; Citation</w:t>
             </w:r>
           </w:p>
         </w:tc>
         <w:tc>
           <w:tcPr>
             <w:tcW w:w="0" w:type="auto"/>
+            <w:tcBorders>
+              <w:top w:val="single" w:sz="4" w:space="0" w:color="2A2B2C"/>
+              <w:left w:val="single" w:sz="4" w:space="0" w:color="2A2B2C"/>
+              <w:bottom w:val="single" w:sz="4" w:space="0" w:color="2A2B2C"/>
+              <w:right w:val="single" w:sz="4" w:space="0" w:color="2A2B2C"/>
+            </w:tcBorders>
+            <w:shd w:val="clear" w:color="auto" w:fill="B3E5A1" w:themeFill="accent6" w:themeFillTint="66"/>
+            <w:tcMar>
+              <w:top w:w="30" w:type="dxa"/>
+              <w:left w:w="30" w:type="dxa"/>
+              <w:bottom w:w="30" w:type="dxa"/>
+              <w:right w:w="30" w:type="dxa"/>
+            </w:tcMar>
             <w:vAlign w:val="center"/>
             <w:hideMark/>
           </w:tcPr>
           <w:p>
             <w:pPr>
               <w:spacing w:before="80" w:after="220"/>
-              <w:jc w:val="center"/>
-              <w:rPr>
-                <w:sz w:val="26"/>
-                <w:szCs w:val="26"/>
-              </w:rPr>
-            </w:pPr>
-            <w:r>
-              <w:rPr>
-                <w:sz w:val="26"/>
-                <w:szCs w:val="26"/>
-              </w:rPr>
-              <w:t>Precision, Recall, F1 của trích dẫn</w:t>
+              <w:rPr>
+                <w:sz w:val="26"/>
+                <w:szCs w:val="26"/>
+              </w:rPr>
+            </w:pPr>
+            <w:r>
+              <w:rPr>
+                <w:b/>
+                <w:bCs/>
+                <w:sz w:val="26"/>
+                <w:szCs w:val="26"/>
+              </w:rPr>
+              <w:t>Faithfulness</w:t>
             </w:r>
           </w:p>
         </w:tc>
         <w:tc>
           <w:tcPr>
             <w:tcW w:w="0" w:type="auto"/>
+            <w:tcBorders>
+              <w:top w:val="single" w:sz="4" w:space="0" w:color="2A2B2C"/>
+              <w:left w:val="single" w:sz="4" w:space="0" w:color="2A2B2C"/>
+              <w:bottom w:val="single" w:sz="4" w:space="0" w:color="2A2B2C"/>
+              <w:right w:val="single" w:sz="4" w:space="0" w:color="2A2B2C"/>
+            </w:tcBorders>
+            <w:tcMar>
+              <w:top w:w="30" w:type="dxa"/>
+              <w:left w:w="30" w:type="dxa"/>
+              <w:bottom w:w="30" w:type="dxa"/>
+              <w:right w:w="30" w:type="dxa"/>
+            </w:tcMar>
             <w:vAlign w:val="center"/>
             <w:hideMark/>
           </w:tcPr>
           <w:p>
             <w:pPr>
               <w:spacing w:before="80" w:after="220"/>
-              <w:jc w:val="center"/>
-              <w:rPr>
-                <w:sz w:val="26"/>
-                <w:szCs w:val="26"/>
-              </w:rPr>
-            </w:pPr>
-            <w:r>
-              <w:rPr>
-                <w:sz w:val="26"/>
-                <w:szCs w:val="26"/>
-              </w:rPr>
-              <w:t>So điều khoản được trích với điều khoản chuẩn</w:t>
+              <w:rPr>
+                <w:sz w:val="26"/>
+                <w:szCs w:val="26"/>
+              </w:rPr>
+            </w:pPr>
+            <w:r>
+              <w:rPr>
+                <w:sz w:val="26"/>
+                <w:szCs w:val="26"/>
+              </w:rPr>
+              <w:t>RAGAS</w:t>
             </w:r>
           </w:p>
         </w:tc>
         <w:tc>
           <w:tcPr>
             <w:tcW w:w="0" w:type="auto"/>
+            <w:tcBorders>
+              <w:top w:val="single" w:sz="4" w:space="0" w:color="2A2B2C"/>
+              <w:left w:val="single" w:sz="4" w:space="0" w:color="2A2B2C"/>
+              <w:bottom w:val="single" w:sz="4" w:space="0" w:color="2A2B2C"/>
+              <w:right w:val="single" w:sz="4" w:space="0" w:color="2A2B2C"/>
+            </w:tcBorders>
+            <w:tcMar>
+              <w:top w:w="30" w:type="dxa"/>
+              <w:left w:w="30" w:type="dxa"/>
+              <w:bottom w:w="30" w:type="dxa"/>
+              <w:right w:w="30" w:type="dxa"/>
+            </w:tcMar>
             <w:vAlign w:val="center"/>
             <w:hideMark/>
           </w:tcPr>
           <w:p>
             <w:pPr>
               <w:spacing w:before="80" w:after="220"/>
-              <w:jc w:val="center"/>
-              <w:rPr>
-                <w:sz w:val="26"/>
-                <w:szCs w:val="26"/>
-              </w:rPr>
-            </w:pPr>
-            <w:r>
-              <w:rPr>
-                <w:sz w:val="26"/>
-                <w:szCs w:val="26"/>
-              </w:rPr>
-              <w:t>Không</w:t>
+              <w:rPr>
+                <w:sz w:val="26"/>
+                <w:szCs w:val="26"/>
+              </w:rPr>
+            </w:pPr>
+            <w:r>
+              <w:rPr>
+                <w:sz w:val="26"/>
+                <w:szCs w:val="26"/>
+              </w:rPr>
+              <w:t>–</w:t>
+            </w:r>
+          </w:p>
+        </w:tc>
+        <w:tc>
+          <w:tcPr>
+            <w:tcW w:w="0" w:type="auto"/>
+            <w:tcBorders>
+              <w:top w:val="single" w:sz="4" w:space="0" w:color="2A2B2C"/>
+              <w:left w:val="single" w:sz="4" w:space="0" w:color="2A2B2C"/>
+              <w:bottom w:val="single" w:sz="4" w:space="0" w:color="2A2B2C"/>
+              <w:right w:val="single" w:sz="4" w:space="0" w:color="2A2B2C"/>
+            </w:tcBorders>
+            <w:tcMar>
+              <w:top w:w="30" w:type="dxa"/>
+              <w:left w:w="30" w:type="dxa"/>
+              <w:bottom w:w="30" w:type="dxa"/>
+              <w:right w:w="30" w:type="dxa"/>
+            </w:tcMar>
+            <w:vAlign w:val="center"/>
+            <w:hideMark/>
+          </w:tcPr>
+          <w:p>
+            <w:pPr>
+              <w:spacing w:before="80" w:after="220"/>
+              <w:rPr>
+                <w:sz w:val="26"/>
+                <w:szCs w:val="26"/>
+              </w:rPr>
+            </w:pPr>
+            <w:r>
+              <w:rPr>
+                <w:rFonts w:ascii="Segoe UI Emoji" w:hAnsi="Segoe UI Emoji" w:cs="Segoe UI Emoji"/>
+                <w:sz w:val="26"/>
+                <w:szCs w:val="26"/>
+              </w:rPr>
+              <w:t>⭐</w:t>
+            </w:r>
+            <w:r>
+              <w:rPr>
+                <w:sz w:val="26"/>
+                <w:szCs w:val="26"/>
+              </w:rPr>
+              <w:t xml:space="preserve"> Chính</w:t>
             </w:r>
           </w:p>
         </w:tc>
       </w:tr>
       <w:tr>
-        <w:trPr>
-          <w:tblCellSpacing w:w="15" w:type="dxa"/>
-        </w:trPr>
+        <w:tc>
+          <w:tcPr>
+            <w:tcW w:w="0" w:type="auto"/>
+            <w:tcBorders>
+              <w:top w:val="single" w:sz="4" w:space="0" w:color="2A2B2C"/>
+              <w:left w:val="single" w:sz="4" w:space="0" w:color="2A2B2C"/>
+              <w:bottom w:val="single" w:sz="4" w:space="0" w:color="2A2B2C"/>
+              <w:right w:val="single" w:sz="4" w:space="0" w:color="2A2B2C"/>
+            </w:tcBorders>
+            <w:tcMar>
+              <w:top w:w="30" w:type="dxa"/>
+              <w:left w:w="30" w:type="dxa"/>
+              <w:bottom w:w="30" w:type="dxa"/>
+              <w:right w:w="30" w:type="dxa"/>
+            </w:tcMar>
+            <w:vAlign w:val="center"/>
+            <w:hideMark/>
+          </w:tcPr>
+          <w:p>
+            <w:pPr>
+              <w:spacing w:before="80" w:after="220"/>
+              <w:rPr>
+                <w:sz w:val="26"/>
+                <w:szCs w:val="26"/>
+              </w:rPr>
+            </w:pPr>
+            <w:r>
+              <w:rPr>
+                <w:sz w:val="26"/>
+                <w:szCs w:val="26"/>
+              </w:rPr>
+              <w:t>10</w:t>
+            </w:r>
+          </w:p>
+        </w:tc>
         <w:tc>
           <w:tcPr>
             <w:tcW w:w="0" w:type="auto"/>
             <w:vMerge/>
+            <w:tcBorders>
+              <w:left w:val="single" w:sz="4" w:space="0" w:color="2A2B2C"/>
+              <w:right w:val="single" w:sz="4" w:space="0" w:color="2A2B2C"/>
+            </w:tcBorders>
+            <w:tcMar>
+              <w:top w:w="30" w:type="dxa"/>
+              <w:left w:w="30" w:type="dxa"/>
+              <w:bottom w:w="30" w:type="dxa"/>
+              <w:right w:w="30" w:type="dxa"/>
+            </w:tcMar>
             <w:vAlign w:val="center"/>
             <w:hideMark/>
           </w:tcPr>
           <w:p>
             <w:pPr>
               <w:spacing w:before="80" w:after="220"/>
-              <w:jc w:val="center"/>
               <w:rPr>
                 <w:sz w:val="26"/>
                 <w:szCs w:val="26"/>
@@ -39136,91 +40846,210 @@
         <w:tc>
           <w:tcPr>
             <w:tcW w:w="0" w:type="auto"/>
+            <w:tcBorders>
+              <w:top w:val="single" w:sz="4" w:space="0" w:color="2A2B2C"/>
+              <w:left w:val="single" w:sz="4" w:space="0" w:color="2A2B2C"/>
+              <w:bottom w:val="single" w:sz="4" w:space="0" w:color="2A2B2C"/>
+              <w:right w:val="single" w:sz="4" w:space="0" w:color="2A2B2C"/>
+            </w:tcBorders>
+            <w:shd w:val="clear" w:color="auto" w:fill="B3E5A1" w:themeFill="accent6" w:themeFillTint="66"/>
+            <w:tcMar>
+              <w:top w:w="30" w:type="dxa"/>
+              <w:left w:w="30" w:type="dxa"/>
+              <w:bottom w:w="30" w:type="dxa"/>
+              <w:right w:w="30" w:type="dxa"/>
+            </w:tcMar>
             <w:vAlign w:val="center"/>
             <w:hideMark/>
           </w:tcPr>
           <w:p>
             <w:pPr>
               <w:spacing w:before="80" w:after="220"/>
-              <w:jc w:val="center"/>
-              <w:rPr>
-                <w:sz w:val="26"/>
-                <w:szCs w:val="26"/>
-              </w:rPr>
-            </w:pPr>
-            <w:r>
-              <w:rPr>
-                <w:sz w:val="26"/>
-                <w:szCs w:val="26"/>
-              </w:rPr>
-              <w:t>Tỉ lệ nhãn [S#] hợp lệ</w:t>
+              <w:rPr>
+                <w:sz w:val="26"/>
+                <w:szCs w:val="26"/>
+              </w:rPr>
+            </w:pPr>
+            <w:r>
+              <w:rPr>
+                <w:sz w:val="26"/>
+                <w:szCs w:val="26"/>
+              </w:rPr>
+              <w:t>Citation F1 (kèm Citation Precision, Citation Recall)</w:t>
             </w:r>
           </w:p>
         </w:tc>
         <w:tc>
           <w:tcPr>
             <w:tcW w:w="0" w:type="auto"/>
+            <w:tcBorders>
+              <w:top w:val="single" w:sz="4" w:space="0" w:color="2A2B2C"/>
+              <w:left w:val="single" w:sz="4" w:space="0" w:color="2A2B2C"/>
+              <w:bottom w:val="single" w:sz="4" w:space="0" w:color="2A2B2C"/>
+              <w:right w:val="single" w:sz="4" w:space="0" w:color="2A2B2C"/>
+            </w:tcBorders>
+            <w:tcMar>
+              <w:top w:w="30" w:type="dxa"/>
+              <w:left w:w="30" w:type="dxa"/>
+              <w:bottom w:w="30" w:type="dxa"/>
+              <w:right w:w="30" w:type="dxa"/>
+            </w:tcMar>
             <w:vAlign w:val="center"/>
             <w:hideMark/>
           </w:tcPr>
           <w:p>
             <w:pPr>
               <w:spacing w:before="80" w:after="220"/>
-              <w:jc w:val="center"/>
-              <w:rPr>
-                <w:sz w:val="26"/>
-                <w:szCs w:val="26"/>
-              </w:rPr>
-            </w:pPr>
-            <w:r>
-              <w:rPr>
-                <w:sz w:val="26"/>
-                <w:szCs w:val="26"/>
-              </w:rPr>
-              <w:t>Nhãn có tồn tại trong EvidencePack không</w:t>
+              <w:rPr>
+                <w:sz w:val="26"/>
+                <w:szCs w:val="26"/>
+              </w:rPr>
+            </w:pPr>
+            <w:r>
+              <w:rPr>
+                <w:sz w:val="26"/>
+                <w:szCs w:val="26"/>
+              </w:rPr>
+              <w:t>Code</w:t>
             </w:r>
           </w:p>
         </w:tc>
         <w:tc>
           <w:tcPr>
             <w:tcW w:w="0" w:type="auto"/>
+            <w:tcBorders>
+              <w:top w:val="single" w:sz="4" w:space="0" w:color="2A2B2C"/>
+              <w:left w:val="single" w:sz="4" w:space="0" w:color="2A2B2C"/>
+              <w:bottom w:val="single" w:sz="4" w:space="0" w:color="2A2B2C"/>
+              <w:right w:val="single" w:sz="4" w:space="0" w:color="2A2B2C"/>
+            </w:tcBorders>
+            <w:tcMar>
+              <w:top w:w="30" w:type="dxa"/>
+              <w:left w:w="30" w:type="dxa"/>
+              <w:bottom w:w="30" w:type="dxa"/>
+              <w:right w:w="30" w:type="dxa"/>
+            </w:tcMar>
             <w:vAlign w:val="center"/>
             <w:hideMark/>
           </w:tcPr>
           <w:p>
             <w:pPr>
               <w:spacing w:before="80" w:after="220"/>
-              <w:jc w:val="center"/>
-              <w:rPr>
-                <w:sz w:val="26"/>
-                <w:szCs w:val="26"/>
-              </w:rPr>
-            </w:pPr>
-            <w:r>
-              <w:rPr>
-                <w:sz w:val="26"/>
-                <w:szCs w:val="26"/>
-              </w:rPr>
-              <w:t>Không</w:t>
+              <w:rPr>
+                <w:sz w:val="26"/>
+                <w:szCs w:val="26"/>
+              </w:rPr>
+            </w:pPr>
+            <w:r>
+              <w:rPr>
+                <w:sz w:val="26"/>
+                <w:szCs w:val="26"/>
+              </w:rPr>
+              <w:t>evidence</w:t>
+            </w:r>
+          </w:p>
+        </w:tc>
+        <w:tc>
+          <w:tcPr>
+            <w:tcW w:w="0" w:type="auto"/>
+            <w:tcBorders>
+              <w:top w:val="single" w:sz="4" w:space="0" w:color="2A2B2C"/>
+              <w:left w:val="single" w:sz="4" w:space="0" w:color="2A2B2C"/>
+              <w:bottom w:val="single" w:sz="4" w:space="0" w:color="2A2B2C"/>
+              <w:right w:val="single" w:sz="4" w:space="0" w:color="2A2B2C"/>
+            </w:tcBorders>
+            <w:tcMar>
+              <w:top w:w="30" w:type="dxa"/>
+              <w:left w:w="30" w:type="dxa"/>
+              <w:bottom w:w="30" w:type="dxa"/>
+              <w:right w:w="30" w:type="dxa"/>
+            </w:tcMar>
+            <w:vAlign w:val="center"/>
+            <w:hideMark/>
+          </w:tcPr>
+          <w:p>
+            <w:pPr>
+              <w:spacing w:before="80" w:after="220"/>
+              <w:rPr>
+                <w:sz w:val="26"/>
+                <w:szCs w:val="26"/>
+              </w:rPr>
+            </w:pPr>
+            <w:r>
+              <w:rPr>
+                <w:rFonts w:ascii="Segoe UI Emoji" w:hAnsi="Segoe UI Emoji" w:cs="Segoe UI Emoji"/>
+                <w:sz w:val="26"/>
+                <w:szCs w:val="26"/>
+              </w:rPr>
+              <w:t>⭐</w:t>
+            </w:r>
+            <w:r>
+              <w:rPr>
+                <w:sz w:val="26"/>
+                <w:szCs w:val="26"/>
+              </w:rPr>
+              <w:t xml:space="preserve"> Chính</w:t>
             </w:r>
           </w:p>
         </w:tc>
       </w:tr>
       <w:tr>
-        <w:trPr>
-          <w:tblCellSpacing w:w="15" w:type="dxa"/>
-        </w:trPr>
+        <w:tc>
+          <w:tcPr>
+            <w:tcW w:w="0" w:type="auto"/>
+            <w:tcBorders>
+              <w:top w:val="single" w:sz="4" w:space="0" w:color="2A2B2C"/>
+              <w:left w:val="single" w:sz="4" w:space="0" w:color="2A2B2C"/>
+              <w:bottom w:val="single" w:sz="4" w:space="0" w:color="2A2B2C"/>
+              <w:right w:val="single" w:sz="4" w:space="0" w:color="2A2B2C"/>
+            </w:tcBorders>
+            <w:tcMar>
+              <w:top w:w="30" w:type="dxa"/>
+              <w:left w:w="30" w:type="dxa"/>
+              <w:bottom w:w="30" w:type="dxa"/>
+              <w:right w:w="30" w:type="dxa"/>
+            </w:tcMar>
+            <w:vAlign w:val="center"/>
+            <w:hideMark/>
+          </w:tcPr>
+          <w:p>
+            <w:pPr>
+              <w:spacing w:before="80" w:after="220"/>
+              <w:rPr>
+                <w:sz w:val="26"/>
+                <w:szCs w:val="26"/>
+              </w:rPr>
+            </w:pPr>
+            <w:r>
+              <w:rPr>
+                <w:sz w:val="26"/>
+                <w:szCs w:val="26"/>
+              </w:rPr>
+              <w:t>11</w:t>
+            </w:r>
+          </w:p>
+        </w:tc>
         <w:tc>
           <w:tcPr>
             <w:tcW w:w="0" w:type="auto"/>
             <w:vMerge/>
+            <w:tcBorders>
+              <w:left w:val="single" w:sz="4" w:space="0" w:color="2A2B2C"/>
+              <w:bottom w:val="single" w:sz="4" w:space="0" w:color="2A2B2C"/>
+              <w:right w:val="single" w:sz="4" w:space="0" w:color="2A2B2C"/>
+            </w:tcBorders>
+            <w:tcMar>
+              <w:top w:w="30" w:type="dxa"/>
+              <w:left w:w="30" w:type="dxa"/>
+              <w:bottom w:w="30" w:type="dxa"/>
+              <w:right w:w="30" w:type="dxa"/>
+            </w:tcMar>
             <w:vAlign w:val="center"/>
             <w:hideMark/>
           </w:tcPr>
           <w:p>
             <w:pPr>
               <w:spacing w:before="80" w:after="220"/>
-              <w:jc w:val="center"/>
               <w:rPr>
                 <w:sz w:val="26"/>
                 <w:szCs w:val="26"/>
@@ -39231,61 +41060,201 @@
         <w:tc>
           <w:tcPr>
             <w:tcW w:w="0" w:type="auto"/>
+            <w:tcBorders>
+              <w:top w:val="single" w:sz="4" w:space="0" w:color="2A2B2C"/>
+              <w:left w:val="single" w:sz="4" w:space="0" w:color="2A2B2C"/>
+              <w:bottom w:val="single" w:sz="4" w:space="0" w:color="2A2B2C"/>
+              <w:right w:val="single" w:sz="4" w:space="0" w:color="2A2B2C"/>
+            </w:tcBorders>
+            <w:tcMar>
+              <w:top w:w="30" w:type="dxa"/>
+              <w:left w:w="30" w:type="dxa"/>
+              <w:bottom w:w="30" w:type="dxa"/>
+              <w:right w:w="30" w:type="dxa"/>
+            </w:tcMar>
             <w:vAlign w:val="center"/>
             <w:hideMark/>
           </w:tcPr>
           <w:p>
             <w:pPr>
               <w:spacing w:before="80" w:after="220"/>
-              <w:jc w:val="center"/>
-              <w:rPr>
-                <w:sz w:val="26"/>
-                <w:szCs w:val="26"/>
-              </w:rPr>
-            </w:pPr>
-            <w:r>
-              <w:rPr>
-                <w:sz w:val="26"/>
-                <w:szCs w:val="26"/>
-              </w:rPr>
-              <w:t>Faithfulness theo từng ý</w:t>
+              <w:rPr>
+                <w:sz w:val="26"/>
+                <w:szCs w:val="26"/>
+              </w:rPr>
+            </w:pPr>
+            <w:r>
+              <w:rPr>
+                <w:sz w:val="26"/>
+                <w:szCs w:val="26"/>
+              </w:rPr>
+              <w:t>Citation Validity</w:t>
             </w:r>
           </w:p>
         </w:tc>
         <w:tc>
           <w:tcPr>
             <w:tcW w:w="0" w:type="auto"/>
+            <w:tcBorders>
+              <w:top w:val="single" w:sz="4" w:space="0" w:color="2A2B2C"/>
+              <w:left w:val="single" w:sz="4" w:space="0" w:color="2A2B2C"/>
+              <w:bottom w:val="single" w:sz="4" w:space="0" w:color="2A2B2C"/>
+              <w:right w:val="single" w:sz="4" w:space="0" w:color="2A2B2C"/>
+            </w:tcBorders>
+            <w:tcMar>
+              <w:top w:w="30" w:type="dxa"/>
+              <w:left w:w="30" w:type="dxa"/>
+              <w:bottom w:w="30" w:type="dxa"/>
+              <w:right w:w="30" w:type="dxa"/>
+            </w:tcMar>
             <w:vAlign w:val="center"/>
             <w:hideMark/>
           </w:tcPr>
           <w:p>
             <w:pPr>
               <w:spacing w:before="80" w:after="220"/>
-              <w:jc w:val="center"/>
-              <w:rPr>
-                <w:sz w:val="26"/>
-                <w:szCs w:val="26"/>
-              </w:rPr>
-            </w:pPr>
-            <w:r>
-              <w:rPr>
-                <w:sz w:val="26"/>
-                <w:szCs w:val="26"/>
-              </w:rPr>
-              <w:t>Judge đối chiếu ý với bằng chứng</w:t>
+              <w:rPr>
+                <w:sz w:val="26"/>
+                <w:szCs w:val="26"/>
+              </w:rPr>
+            </w:pPr>
+            <w:r>
+              <w:rPr>
+                <w:sz w:val="26"/>
+                <w:szCs w:val="26"/>
+              </w:rPr>
+              <w:t>Code</w:t>
             </w:r>
           </w:p>
         </w:tc>
         <w:tc>
           <w:tcPr>
             <w:tcW w:w="0" w:type="auto"/>
+            <w:tcBorders>
+              <w:top w:val="single" w:sz="4" w:space="0" w:color="2A2B2C"/>
+              <w:left w:val="single" w:sz="4" w:space="0" w:color="2A2B2C"/>
+              <w:bottom w:val="single" w:sz="4" w:space="0" w:color="2A2B2C"/>
+              <w:right w:val="single" w:sz="4" w:space="0" w:color="2A2B2C"/>
+            </w:tcBorders>
+            <w:tcMar>
+              <w:top w:w="30" w:type="dxa"/>
+              <w:left w:w="30" w:type="dxa"/>
+              <w:bottom w:w="30" w:type="dxa"/>
+              <w:right w:w="30" w:type="dxa"/>
+            </w:tcMar>
             <w:vAlign w:val="center"/>
             <w:hideMark/>
           </w:tcPr>
           <w:p>
             <w:pPr>
               <w:spacing w:before="80" w:after="220"/>
-              <w:jc w:val="center"/>
+              <w:rPr>
+                <w:sz w:val="26"/>
+                <w:szCs w:val="26"/>
+              </w:rPr>
+            </w:pPr>
+            <w:r>
+              <w:rPr>
+                <w:sz w:val="26"/>
+                <w:szCs w:val="26"/>
+              </w:rPr>
+              <w:t>–</w:t>
+            </w:r>
+          </w:p>
+        </w:tc>
+        <w:tc>
+          <w:tcPr>
+            <w:tcW w:w="0" w:type="auto"/>
+            <w:tcBorders>
+              <w:top w:val="single" w:sz="4" w:space="0" w:color="2A2B2C"/>
+              <w:left w:val="single" w:sz="4" w:space="0" w:color="2A2B2C"/>
+              <w:bottom w:val="single" w:sz="4" w:space="0" w:color="2A2B2C"/>
+              <w:right w:val="single" w:sz="4" w:space="0" w:color="2A2B2C"/>
+            </w:tcBorders>
+            <w:tcMar>
+              <w:top w:w="30" w:type="dxa"/>
+              <w:left w:w="30" w:type="dxa"/>
+              <w:bottom w:w="30" w:type="dxa"/>
+              <w:right w:w="30" w:type="dxa"/>
+            </w:tcMar>
+            <w:vAlign w:val="center"/>
+            <w:hideMark/>
+          </w:tcPr>
+          <w:p>
+            <w:pPr>
+              <w:spacing w:before="80" w:after="220"/>
+              <w:rPr>
+                <w:sz w:val="26"/>
+                <w:szCs w:val="26"/>
+              </w:rPr>
+            </w:pPr>
+            <w:r>
+              <w:rPr>
+                <w:sz w:val="26"/>
+                <w:szCs w:val="26"/>
+              </w:rPr>
+              <w:t>Phụ</w:t>
+            </w:r>
+          </w:p>
+        </w:tc>
+      </w:tr>
+      <w:tr>
+        <w:tc>
+          <w:tcPr>
+            <w:tcW w:w="0" w:type="auto"/>
+            <w:tcBorders>
+              <w:top w:val="single" w:sz="4" w:space="0" w:color="2A2B2C"/>
+              <w:left w:val="single" w:sz="4" w:space="0" w:color="2A2B2C"/>
+              <w:bottom w:val="single" w:sz="4" w:space="0" w:color="2A2B2C"/>
+              <w:right w:val="single" w:sz="4" w:space="0" w:color="2A2B2C"/>
+            </w:tcBorders>
+            <w:tcMar>
+              <w:top w:w="30" w:type="dxa"/>
+              <w:left w:w="30" w:type="dxa"/>
+              <w:bottom w:w="30" w:type="dxa"/>
+              <w:right w:w="30" w:type="dxa"/>
+            </w:tcMar>
+            <w:vAlign w:val="center"/>
+            <w:hideMark/>
+          </w:tcPr>
+          <w:p>
+            <w:pPr>
+              <w:spacing w:before="80" w:after="220"/>
+              <w:rPr>
+                <w:sz w:val="26"/>
+                <w:szCs w:val="26"/>
+              </w:rPr>
+            </w:pPr>
+            <w:r>
+              <w:rPr>
+                <w:sz w:val="26"/>
+                <w:szCs w:val="26"/>
+              </w:rPr>
+              <w:t>12</w:t>
+            </w:r>
+          </w:p>
+        </w:tc>
+        <w:tc>
+          <w:tcPr>
+            <w:tcW w:w="0" w:type="auto"/>
+            <w:tcBorders>
+              <w:top w:val="single" w:sz="4" w:space="0" w:color="2A2B2C"/>
+              <w:left w:val="single" w:sz="4" w:space="0" w:color="2A2B2C"/>
+              <w:bottom w:val="single" w:sz="4" w:space="0" w:color="2A2B2C"/>
+              <w:right w:val="single" w:sz="4" w:space="0" w:color="2A2B2C"/>
+            </w:tcBorders>
+            <w:tcMar>
+              <w:top w:w="30" w:type="dxa"/>
+              <w:left w:w="30" w:type="dxa"/>
+              <w:bottom w:w="30" w:type="dxa"/>
+              <w:right w:w="30" w:type="dxa"/>
+            </w:tcMar>
+            <w:vAlign w:val="center"/>
+            <w:hideMark/>
+          </w:tcPr>
+          <w:p>
+            <w:pPr>
+              <w:spacing w:before="80" w:after="220"/>
               <w:rPr>
                 <w:sz w:val="26"/>
                 <w:szCs w:val="26"/>
@@ -39298,26 +41267,208 @@
                 <w:sz w:val="26"/>
                 <w:szCs w:val="26"/>
               </w:rPr>
-              <w:t>Có</w:t>
+              <w:t>Relevance</w:t>
+            </w:r>
+          </w:p>
+        </w:tc>
+        <w:tc>
+          <w:tcPr>
+            <w:tcW w:w="0" w:type="auto"/>
+            <w:tcBorders>
+              <w:top w:val="single" w:sz="4" w:space="0" w:color="2A2B2C"/>
+              <w:left w:val="single" w:sz="4" w:space="0" w:color="2A2B2C"/>
+              <w:bottom w:val="single" w:sz="4" w:space="0" w:color="2A2B2C"/>
+              <w:right w:val="single" w:sz="4" w:space="0" w:color="2A2B2C"/>
+            </w:tcBorders>
+            <w:tcMar>
+              <w:top w:w="30" w:type="dxa"/>
+              <w:left w:w="30" w:type="dxa"/>
+              <w:bottom w:w="30" w:type="dxa"/>
+              <w:right w:w="30" w:type="dxa"/>
+            </w:tcMar>
+            <w:vAlign w:val="center"/>
+            <w:hideMark/>
+          </w:tcPr>
+          <w:p>
+            <w:pPr>
+              <w:spacing w:before="80" w:after="220"/>
+              <w:rPr>
+                <w:sz w:val="26"/>
+                <w:szCs w:val="26"/>
+              </w:rPr>
+            </w:pPr>
+            <w:r>
+              <w:rPr>
+                <w:sz w:val="26"/>
+                <w:szCs w:val="26"/>
+              </w:rPr>
+              <w:t>Answer Relevancy</w:t>
+            </w:r>
+          </w:p>
+        </w:tc>
+        <w:tc>
+          <w:tcPr>
+            <w:tcW w:w="0" w:type="auto"/>
+            <w:tcBorders>
+              <w:top w:val="single" w:sz="4" w:space="0" w:color="2A2B2C"/>
+              <w:left w:val="single" w:sz="4" w:space="0" w:color="2A2B2C"/>
+              <w:bottom w:val="single" w:sz="4" w:space="0" w:color="2A2B2C"/>
+              <w:right w:val="single" w:sz="4" w:space="0" w:color="2A2B2C"/>
+            </w:tcBorders>
+            <w:tcMar>
+              <w:top w:w="30" w:type="dxa"/>
+              <w:left w:w="30" w:type="dxa"/>
+              <w:bottom w:w="30" w:type="dxa"/>
+              <w:right w:w="30" w:type="dxa"/>
+            </w:tcMar>
+            <w:vAlign w:val="center"/>
+            <w:hideMark/>
+          </w:tcPr>
+          <w:p>
+            <w:pPr>
+              <w:spacing w:before="80" w:after="220"/>
+              <w:rPr>
+                <w:sz w:val="26"/>
+                <w:szCs w:val="26"/>
+              </w:rPr>
+            </w:pPr>
+            <w:r>
+              <w:rPr>
+                <w:sz w:val="26"/>
+                <w:szCs w:val="26"/>
+              </w:rPr>
+              <w:t>RAGAS</w:t>
+            </w:r>
+          </w:p>
+        </w:tc>
+        <w:tc>
+          <w:tcPr>
+            <w:tcW w:w="0" w:type="auto"/>
+            <w:tcBorders>
+              <w:top w:val="single" w:sz="4" w:space="0" w:color="2A2B2C"/>
+              <w:left w:val="single" w:sz="4" w:space="0" w:color="2A2B2C"/>
+              <w:bottom w:val="single" w:sz="4" w:space="0" w:color="2A2B2C"/>
+              <w:right w:val="single" w:sz="4" w:space="0" w:color="2A2B2C"/>
+            </w:tcBorders>
+            <w:tcMar>
+              <w:top w:w="30" w:type="dxa"/>
+              <w:left w:w="30" w:type="dxa"/>
+              <w:bottom w:w="30" w:type="dxa"/>
+              <w:right w:w="30" w:type="dxa"/>
+            </w:tcMar>
+            <w:vAlign w:val="center"/>
+            <w:hideMark/>
+          </w:tcPr>
+          <w:p>
+            <w:pPr>
+              <w:spacing w:before="80" w:after="220"/>
+              <w:rPr>
+                <w:sz w:val="26"/>
+                <w:szCs w:val="26"/>
+              </w:rPr>
+            </w:pPr>
+            <w:r>
+              <w:rPr>
+                <w:sz w:val="26"/>
+                <w:szCs w:val="26"/>
+              </w:rPr>
+              <w:t>–</w:t>
+            </w:r>
+          </w:p>
+        </w:tc>
+        <w:tc>
+          <w:tcPr>
+            <w:tcW w:w="0" w:type="auto"/>
+            <w:tcBorders>
+              <w:top w:val="single" w:sz="4" w:space="0" w:color="2A2B2C"/>
+              <w:left w:val="single" w:sz="4" w:space="0" w:color="2A2B2C"/>
+              <w:bottom w:val="single" w:sz="4" w:space="0" w:color="2A2B2C"/>
+              <w:right w:val="single" w:sz="4" w:space="0" w:color="2A2B2C"/>
+            </w:tcBorders>
+            <w:tcMar>
+              <w:top w:w="30" w:type="dxa"/>
+              <w:left w:w="30" w:type="dxa"/>
+              <w:bottom w:w="30" w:type="dxa"/>
+              <w:right w:w="30" w:type="dxa"/>
+            </w:tcMar>
+            <w:vAlign w:val="center"/>
+            <w:hideMark/>
+          </w:tcPr>
+          <w:p>
+            <w:pPr>
+              <w:spacing w:before="80" w:after="220"/>
+              <w:rPr>
+                <w:sz w:val="26"/>
+                <w:szCs w:val="26"/>
+              </w:rPr>
+            </w:pPr>
+            <w:r>
+              <w:rPr>
+                <w:sz w:val="26"/>
+                <w:szCs w:val="26"/>
+              </w:rPr>
+              <w:t>Phụ</w:t>
             </w:r>
           </w:p>
         </w:tc>
       </w:tr>
       <w:tr>
-        <w:trPr>
-          <w:tblCellSpacing w:w="15" w:type="dxa"/>
-        </w:trPr>
+        <w:tc>
+          <w:tcPr>
+            <w:tcW w:w="0" w:type="auto"/>
+            <w:tcBorders>
+              <w:top w:val="single" w:sz="4" w:space="0" w:color="2A2B2C"/>
+              <w:left w:val="single" w:sz="4" w:space="0" w:color="2A2B2C"/>
+              <w:bottom w:val="single" w:sz="4" w:space="0" w:color="2A2B2C"/>
+              <w:right w:val="single" w:sz="4" w:space="0" w:color="2A2B2C"/>
+            </w:tcBorders>
+            <w:tcMar>
+              <w:top w:w="30" w:type="dxa"/>
+              <w:left w:w="30" w:type="dxa"/>
+              <w:bottom w:w="30" w:type="dxa"/>
+              <w:right w:w="30" w:type="dxa"/>
+            </w:tcMar>
+            <w:vAlign w:val="center"/>
+            <w:hideMark/>
+          </w:tcPr>
+          <w:p>
+            <w:pPr>
+              <w:spacing w:before="80" w:after="220"/>
+              <w:rPr>
+                <w:sz w:val="26"/>
+                <w:szCs w:val="26"/>
+              </w:rPr>
+            </w:pPr>
+            <w:r>
+              <w:rPr>
+                <w:sz w:val="26"/>
+                <w:szCs w:val="26"/>
+              </w:rPr>
+              <w:t>13</w:t>
+            </w:r>
+          </w:p>
+        </w:tc>
         <w:tc>
           <w:tcPr>
             <w:tcW w:w="0" w:type="auto"/>
             <w:vMerge w:val="restart"/>
+            <w:tcBorders>
+              <w:top w:val="single" w:sz="4" w:space="0" w:color="2A2B2C"/>
+              <w:left w:val="single" w:sz="4" w:space="0" w:color="2A2B2C"/>
+              <w:right w:val="single" w:sz="4" w:space="0" w:color="2A2B2C"/>
+            </w:tcBorders>
+            <w:tcMar>
+              <w:top w:w="30" w:type="dxa"/>
+              <w:left w:w="30" w:type="dxa"/>
+              <w:bottom w:w="30" w:type="dxa"/>
+              <w:right w:w="30" w:type="dxa"/>
+            </w:tcMar>
             <w:vAlign w:val="center"/>
             <w:hideMark/>
           </w:tcPr>
           <w:p>
             <w:pPr>
               <w:spacing w:before="80" w:after="220"/>
-              <w:jc w:val="center"/>
               <w:rPr>
                 <w:sz w:val="26"/>
                 <w:szCs w:val="26"/>
@@ -39330,98 +41481,251 @@
                 <w:sz w:val="26"/>
                 <w:szCs w:val="26"/>
               </w:rPr>
-              <w:t>4. Đặc thù VTAgent</w:t>
+              <w:t>Abstention</w:t>
+            </w:r>
+          </w:p>
+          <w:p>
+            <w:pPr>
+              <w:spacing w:before="80" w:after="220"/>
+              <w:rPr>
+                <w:b/>
+                <w:bCs/>
+                <w:sz w:val="26"/>
+                <w:szCs w:val="26"/>
+                <w:lang w:val="vi-VN"/>
+              </w:rPr>
+            </w:pPr>
+          </w:p>
+          <w:p>
+            <w:pPr>
+              <w:spacing w:before="80" w:after="220"/>
+              <w:rPr>
+                <w:b/>
+                <w:bCs/>
+                <w:sz w:val="26"/>
+                <w:szCs w:val="26"/>
+                <w:lang w:val="vi-VN"/>
+              </w:rPr>
+            </w:pPr>
+            <w:r>
+              <w:rPr>
+                <w:b/>
+                <w:bCs/>
+                <w:sz w:val="26"/>
+                <w:szCs w:val="26"/>
+                <w:lang w:val="vi-VN"/>
+              </w:rPr>
+              <w:lastRenderedPageBreak/>
+              <w:t>System</w:t>
             </w:r>
           </w:p>
         </w:tc>
         <w:tc>
           <w:tcPr>
             <w:tcW w:w="0" w:type="auto"/>
+            <w:tcBorders>
+              <w:top w:val="single" w:sz="4" w:space="0" w:color="2A2B2C"/>
+              <w:left w:val="single" w:sz="4" w:space="0" w:color="2A2B2C"/>
+              <w:bottom w:val="single" w:sz="4" w:space="0" w:color="2A2B2C"/>
+              <w:right w:val="single" w:sz="4" w:space="0" w:color="2A2B2C"/>
+            </w:tcBorders>
+            <w:tcMar>
+              <w:top w:w="30" w:type="dxa"/>
+              <w:left w:w="30" w:type="dxa"/>
+              <w:bottom w:w="30" w:type="dxa"/>
+              <w:right w:w="30" w:type="dxa"/>
+            </w:tcMar>
             <w:vAlign w:val="center"/>
             <w:hideMark/>
           </w:tcPr>
           <w:p>
             <w:pPr>
               <w:spacing w:before="80" w:after="220"/>
-              <w:jc w:val="center"/>
-              <w:rPr>
-                <w:sz w:val="26"/>
-                <w:szCs w:val="26"/>
-              </w:rPr>
-            </w:pPr>
-            <w:r>
-              <w:rPr>
-                <w:sz w:val="26"/>
-                <w:szCs w:val="26"/>
-              </w:rPr>
-              <w:t>calculate: khớp số</w:t>
+              <w:rPr>
+                <w:sz w:val="26"/>
+                <w:szCs w:val="26"/>
+              </w:rPr>
+            </w:pPr>
+            <w:r>
+              <w:rPr>
+                <w:sz w:val="26"/>
+                <w:szCs w:val="26"/>
+              </w:rPr>
+              <w:lastRenderedPageBreak/>
+              <w:t>Refusal Accuracy</w:t>
             </w:r>
           </w:p>
         </w:tc>
         <w:tc>
           <w:tcPr>
             <w:tcW w:w="0" w:type="auto"/>
+            <w:tcBorders>
+              <w:top w:val="single" w:sz="4" w:space="0" w:color="2A2B2C"/>
+              <w:left w:val="single" w:sz="4" w:space="0" w:color="2A2B2C"/>
+              <w:bottom w:val="single" w:sz="4" w:space="0" w:color="2A2B2C"/>
+              <w:right w:val="single" w:sz="4" w:space="0" w:color="2A2B2C"/>
+            </w:tcBorders>
+            <w:tcMar>
+              <w:top w:w="30" w:type="dxa"/>
+              <w:left w:w="30" w:type="dxa"/>
+              <w:bottom w:w="30" w:type="dxa"/>
+              <w:right w:w="30" w:type="dxa"/>
+            </w:tcMar>
             <w:vAlign w:val="center"/>
             <w:hideMark/>
           </w:tcPr>
           <w:p>
             <w:pPr>
               <w:spacing w:before="80" w:after="220"/>
-              <w:jc w:val="center"/>
-              <w:rPr>
-                <w:sz w:val="26"/>
-                <w:szCs w:val="26"/>
-              </w:rPr>
-            </w:pPr>
-            <w:r>
-              <w:rPr>
-                <w:sz w:val="26"/>
-                <w:szCs w:val="26"/>
-              </w:rPr>
-              <w:t>So kết quả với đáp án tính tay</w:t>
+              <w:rPr>
+                <w:sz w:val="26"/>
+                <w:szCs w:val="26"/>
+              </w:rPr>
+            </w:pPr>
+            <w:r>
+              <w:rPr>
+                <w:sz w:val="26"/>
+                <w:szCs w:val="26"/>
+              </w:rPr>
+              <w:t>Code</w:t>
             </w:r>
           </w:p>
         </w:tc>
         <w:tc>
           <w:tcPr>
             <w:tcW w:w="0" w:type="auto"/>
+            <w:tcBorders>
+              <w:top w:val="single" w:sz="4" w:space="0" w:color="2A2B2C"/>
+              <w:left w:val="single" w:sz="4" w:space="0" w:color="2A2B2C"/>
+              <w:bottom w:val="single" w:sz="4" w:space="0" w:color="2A2B2C"/>
+              <w:right w:val="single" w:sz="4" w:space="0" w:color="2A2B2C"/>
+            </w:tcBorders>
+            <w:tcMar>
+              <w:top w:w="30" w:type="dxa"/>
+              <w:left w:w="30" w:type="dxa"/>
+              <w:bottom w:w="30" w:type="dxa"/>
+              <w:right w:w="30" w:type="dxa"/>
+            </w:tcMar>
             <w:vAlign w:val="center"/>
             <w:hideMark/>
           </w:tcPr>
           <w:p>
             <w:pPr>
               <w:spacing w:before="80" w:after="220"/>
-              <w:jc w:val="center"/>
-              <w:rPr>
-                <w:sz w:val="26"/>
-                <w:szCs w:val="26"/>
-              </w:rPr>
-            </w:pPr>
-            <w:r>
-              <w:rPr>
-                <w:sz w:val="26"/>
-                <w:szCs w:val="26"/>
-              </w:rPr>
-              <w:t>Không</w:t>
+              <w:rPr>
+                <w:sz w:val="26"/>
+                <w:szCs w:val="26"/>
+              </w:rPr>
+            </w:pPr>
+            <w:r>
+              <w:rPr>
+                <w:sz w:val="26"/>
+                <w:szCs w:val="26"/>
+              </w:rPr>
+              <w:t>answerable</w:t>
+            </w:r>
+          </w:p>
+        </w:tc>
+        <w:tc>
+          <w:tcPr>
+            <w:tcW w:w="0" w:type="auto"/>
+            <w:tcBorders>
+              <w:top w:val="single" w:sz="4" w:space="0" w:color="2A2B2C"/>
+              <w:left w:val="single" w:sz="4" w:space="0" w:color="2A2B2C"/>
+              <w:bottom w:val="single" w:sz="4" w:space="0" w:color="2A2B2C"/>
+              <w:right w:val="single" w:sz="4" w:space="0" w:color="2A2B2C"/>
+            </w:tcBorders>
+            <w:tcMar>
+              <w:top w:w="30" w:type="dxa"/>
+              <w:left w:w="30" w:type="dxa"/>
+              <w:bottom w:w="30" w:type="dxa"/>
+              <w:right w:w="30" w:type="dxa"/>
+            </w:tcMar>
+            <w:vAlign w:val="center"/>
+            <w:hideMark/>
+          </w:tcPr>
+          <w:p>
+            <w:pPr>
+              <w:spacing w:before="80" w:after="220"/>
+              <w:rPr>
+                <w:sz w:val="26"/>
+                <w:szCs w:val="26"/>
+              </w:rPr>
+            </w:pPr>
+            <w:r>
+              <w:rPr>
+                <w:rFonts w:ascii="Segoe UI Emoji" w:hAnsi="Segoe UI Emoji" w:cs="Segoe UI Emoji"/>
+                <w:sz w:val="26"/>
+                <w:szCs w:val="26"/>
+              </w:rPr>
+              <w:t>⭐</w:t>
+            </w:r>
+            <w:r>
+              <w:rPr>
+                <w:sz w:val="26"/>
+                <w:szCs w:val="26"/>
+              </w:rPr>
+              <w:t xml:space="preserve"> Chính</w:t>
             </w:r>
           </w:p>
         </w:tc>
       </w:tr>
       <w:tr>
-        <w:trPr>
-          <w:tblCellSpacing w:w="15" w:type="dxa"/>
-        </w:trPr>
+        <w:tc>
+          <w:tcPr>
+            <w:tcW w:w="0" w:type="auto"/>
+            <w:tcBorders>
+              <w:top w:val="single" w:sz="4" w:space="0" w:color="2A2B2C"/>
+              <w:left w:val="single" w:sz="4" w:space="0" w:color="2A2B2C"/>
+              <w:bottom w:val="single" w:sz="4" w:space="0" w:color="2A2B2C"/>
+              <w:right w:val="single" w:sz="4" w:space="0" w:color="2A2B2C"/>
+            </w:tcBorders>
+            <w:tcMar>
+              <w:top w:w="30" w:type="dxa"/>
+              <w:left w:w="30" w:type="dxa"/>
+              <w:bottom w:w="30" w:type="dxa"/>
+              <w:right w:w="30" w:type="dxa"/>
+            </w:tcMar>
+            <w:vAlign w:val="center"/>
+            <w:hideMark/>
+          </w:tcPr>
+          <w:p>
+            <w:pPr>
+              <w:spacing w:before="80" w:after="220"/>
+              <w:rPr>
+                <w:sz w:val="26"/>
+                <w:szCs w:val="26"/>
+              </w:rPr>
+            </w:pPr>
+            <w:r>
+              <w:rPr>
+                <w:sz w:val="26"/>
+                <w:szCs w:val="26"/>
+              </w:rPr>
+              <w:t>14</w:t>
+            </w:r>
+          </w:p>
+        </w:tc>
         <w:tc>
           <w:tcPr>
             <w:tcW w:w="0" w:type="auto"/>
             <w:vMerge/>
+            <w:tcBorders>
+              <w:left w:val="single" w:sz="4" w:space="0" w:color="2A2B2C"/>
+              <w:right w:val="single" w:sz="4" w:space="0" w:color="2A2B2C"/>
+            </w:tcBorders>
+            <w:tcMar>
+              <w:top w:w="30" w:type="dxa"/>
+              <w:left w:w="30" w:type="dxa"/>
+              <w:bottom w:w="30" w:type="dxa"/>
+              <w:right w:w="30" w:type="dxa"/>
+            </w:tcMar>
             <w:vAlign w:val="center"/>
             <w:hideMark/>
           </w:tcPr>
           <w:p>
             <w:pPr>
               <w:spacing w:before="80" w:after="220"/>
-              <w:jc w:val="center"/>
               <w:rPr>
                 <w:sz w:val="26"/>
                 <w:szCs w:val="26"/>
@@ -39432,91 +41736,209 @@
         <w:tc>
           <w:tcPr>
             <w:tcW w:w="0" w:type="auto"/>
+            <w:tcBorders>
+              <w:top w:val="single" w:sz="4" w:space="0" w:color="2A2B2C"/>
+              <w:left w:val="single" w:sz="4" w:space="0" w:color="2A2B2C"/>
+              <w:bottom w:val="single" w:sz="4" w:space="0" w:color="2A2B2C"/>
+              <w:right w:val="single" w:sz="4" w:space="0" w:color="2A2B2C"/>
+            </w:tcBorders>
+            <w:tcMar>
+              <w:top w:w="30" w:type="dxa"/>
+              <w:left w:w="30" w:type="dxa"/>
+              <w:bottom w:w="30" w:type="dxa"/>
+              <w:right w:w="30" w:type="dxa"/>
+            </w:tcMar>
             <w:vAlign w:val="center"/>
             <w:hideMark/>
           </w:tcPr>
           <w:p>
             <w:pPr>
               <w:spacing w:before="80" w:after="220"/>
-              <w:jc w:val="center"/>
-              <w:rPr>
-                <w:sz w:val="26"/>
-                <w:szCs w:val="26"/>
-              </w:rPr>
-            </w:pPr>
-            <w:r>
-              <w:rPr>
-                <w:sz w:val="26"/>
-                <w:szCs w:val="26"/>
-              </w:rPr>
-              <w:t>Rà soát rủi ro: precision, recall theo từng luật</w:t>
+              <w:rPr>
+                <w:sz w:val="26"/>
+                <w:szCs w:val="26"/>
+              </w:rPr>
+            </w:pPr>
+            <w:r>
+              <w:rPr>
+                <w:sz w:val="26"/>
+                <w:szCs w:val="26"/>
+              </w:rPr>
+              <w:t>False Refusal Rate</w:t>
             </w:r>
           </w:p>
         </w:tc>
         <w:tc>
           <w:tcPr>
             <w:tcW w:w="0" w:type="auto"/>
+            <w:tcBorders>
+              <w:top w:val="single" w:sz="4" w:space="0" w:color="2A2B2C"/>
+              <w:left w:val="single" w:sz="4" w:space="0" w:color="2A2B2C"/>
+              <w:bottom w:val="single" w:sz="4" w:space="0" w:color="2A2B2C"/>
+              <w:right w:val="single" w:sz="4" w:space="0" w:color="2A2B2C"/>
+            </w:tcBorders>
+            <w:tcMar>
+              <w:top w:w="30" w:type="dxa"/>
+              <w:left w:w="30" w:type="dxa"/>
+              <w:bottom w:w="30" w:type="dxa"/>
+              <w:right w:w="30" w:type="dxa"/>
+            </w:tcMar>
             <w:vAlign w:val="center"/>
             <w:hideMark/>
           </w:tcPr>
           <w:p>
             <w:pPr>
               <w:spacing w:before="80" w:after="220"/>
-              <w:jc w:val="center"/>
-              <w:rPr>
-                <w:sz w:val="26"/>
-                <w:szCs w:val="26"/>
-              </w:rPr>
-            </w:pPr>
-            <w:r>
-              <w:rPr>
-                <w:sz w:val="26"/>
-                <w:szCs w:val="26"/>
-              </w:rPr>
-              <w:t>Trên hợp đồng giả lập có lỗi cài sẵn</w:t>
+              <w:rPr>
+                <w:sz w:val="26"/>
+                <w:szCs w:val="26"/>
+              </w:rPr>
+            </w:pPr>
+            <w:r>
+              <w:rPr>
+                <w:sz w:val="26"/>
+                <w:szCs w:val="26"/>
+              </w:rPr>
+              <w:t>Code</w:t>
             </w:r>
           </w:p>
         </w:tc>
         <w:tc>
           <w:tcPr>
             <w:tcW w:w="0" w:type="auto"/>
+            <w:tcBorders>
+              <w:top w:val="single" w:sz="4" w:space="0" w:color="2A2B2C"/>
+              <w:left w:val="single" w:sz="4" w:space="0" w:color="2A2B2C"/>
+              <w:bottom w:val="single" w:sz="4" w:space="0" w:color="2A2B2C"/>
+              <w:right w:val="single" w:sz="4" w:space="0" w:color="2A2B2C"/>
+            </w:tcBorders>
+            <w:tcMar>
+              <w:top w:w="30" w:type="dxa"/>
+              <w:left w:w="30" w:type="dxa"/>
+              <w:bottom w:w="30" w:type="dxa"/>
+              <w:right w:w="30" w:type="dxa"/>
+            </w:tcMar>
             <w:vAlign w:val="center"/>
             <w:hideMark/>
           </w:tcPr>
           <w:p>
             <w:pPr>
               <w:spacing w:before="80" w:after="220"/>
-              <w:jc w:val="center"/>
-              <w:rPr>
-                <w:sz w:val="26"/>
-                <w:szCs w:val="26"/>
-              </w:rPr>
-            </w:pPr>
-            <w:r>
-              <w:rPr>
-                <w:sz w:val="26"/>
-                <w:szCs w:val="26"/>
-              </w:rPr>
-              <w:t>Không</w:t>
+              <w:rPr>
+                <w:sz w:val="26"/>
+                <w:szCs w:val="26"/>
+              </w:rPr>
+            </w:pPr>
+            <w:r>
+              <w:rPr>
+                <w:sz w:val="26"/>
+                <w:szCs w:val="26"/>
+              </w:rPr>
+              <w:t>answerable</w:t>
+            </w:r>
+          </w:p>
+        </w:tc>
+        <w:tc>
+          <w:tcPr>
+            <w:tcW w:w="0" w:type="auto"/>
+            <w:tcBorders>
+              <w:top w:val="single" w:sz="4" w:space="0" w:color="2A2B2C"/>
+              <w:left w:val="single" w:sz="4" w:space="0" w:color="2A2B2C"/>
+              <w:bottom w:val="single" w:sz="4" w:space="0" w:color="2A2B2C"/>
+              <w:right w:val="single" w:sz="4" w:space="0" w:color="2A2B2C"/>
+            </w:tcBorders>
+            <w:tcMar>
+              <w:top w:w="30" w:type="dxa"/>
+              <w:left w:w="30" w:type="dxa"/>
+              <w:bottom w:w="30" w:type="dxa"/>
+              <w:right w:w="30" w:type="dxa"/>
+            </w:tcMar>
+            <w:vAlign w:val="center"/>
+            <w:hideMark/>
+          </w:tcPr>
+          <w:p>
+            <w:pPr>
+              <w:spacing w:before="80" w:after="220"/>
+              <w:rPr>
+                <w:sz w:val="26"/>
+                <w:szCs w:val="26"/>
+              </w:rPr>
+            </w:pPr>
+            <w:r>
+              <w:rPr>
+                <w:rFonts w:ascii="Segoe UI Emoji" w:hAnsi="Segoe UI Emoji" w:cs="Segoe UI Emoji"/>
+                <w:sz w:val="26"/>
+                <w:szCs w:val="26"/>
+              </w:rPr>
+              <w:t>⭐</w:t>
+            </w:r>
+            <w:r>
+              <w:rPr>
+                <w:sz w:val="26"/>
+                <w:szCs w:val="26"/>
+              </w:rPr>
+              <w:t xml:space="preserve"> Chính</w:t>
             </w:r>
           </w:p>
         </w:tc>
       </w:tr>
       <w:tr>
-        <w:trPr>
-          <w:tblCellSpacing w:w="15" w:type="dxa"/>
-        </w:trPr>
+        <w:tc>
+          <w:tcPr>
+            <w:tcW w:w="0" w:type="auto"/>
+            <w:tcBorders>
+              <w:top w:val="single" w:sz="4" w:space="0" w:color="2A2B2C"/>
+              <w:left w:val="single" w:sz="4" w:space="0" w:color="2A2B2C"/>
+              <w:bottom w:val="single" w:sz="4" w:space="0" w:color="2A2B2C"/>
+              <w:right w:val="single" w:sz="4" w:space="0" w:color="2A2B2C"/>
+            </w:tcBorders>
+            <w:tcMar>
+              <w:top w:w="30" w:type="dxa"/>
+              <w:left w:w="30" w:type="dxa"/>
+              <w:bottom w:w="30" w:type="dxa"/>
+              <w:right w:w="30" w:type="dxa"/>
+            </w:tcMar>
+            <w:vAlign w:val="center"/>
+            <w:hideMark/>
+          </w:tcPr>
+          <w:p>
+            <w:pPr>
+              <w:spacing w:before="80" w:after="220"/>
+              <w:rPr>
+                <w:sz w:val="26"/>
+                <w:szCs w:val="26"/>
+              </w:rPr>
+            </w:pPr>
+            <w:r>
+              <w:rPr>
+                <w:sz w:val="26"/>
+                <w:szCs w:val="26"/>
+              </w:rPr>
+              <w:lastRenderedPageBreak/>
+              <w:t>15</w:t>
+            </w:r>
+          </w:p>
+        </w:tc>
         <w:tc>
           <w:tcPr>
             <w:tcW w:w="0" w:type="auto"/>
             <w:vMerge/>
+            <w:tcBorders>
+              <w:left w:val="single" w:sz="4" w:space="0" w:color="2A2B2C"/>
+              <w:right w:val="single" w:sz="4" w:space="0" w:color="2A2B2C"/>
+            </w:tcBorders>
+            <w:tcMar>
+              <w:top w:w="30" w:type="dxa"/>
+              <w:left w:w="30" w:type="dxa"/>
+              <w:bottom w:w="30" w:type="dxa"/>
+              <w:right w:w="30" w:type="dxa"/>
+            </w:tcMar>
             <w:vAlign w:val="center"/>
             <w:hideMark/>
           </w:tcPr>
           <w:p>
             <w:pPr>
               <w:spacing w:before="80" w:after="220"/>
-              <w:jc w:val="center"/>
               <w:rPr>
                 <w:sz w:val="26"/>
                 <w:szCs w:val="26"/>
@@ -39527,91 +41949,211 @@
         <w:tc>
           <w:tcPr>
             <w:tcW w:w="0" w:type="auto"/>
+            <w:tcBorders>
+              <w:top w:val="single" w:sz="4" w:space="0" w:color="2A2B2C"/>
+              <w:left w:val="single" w:sz="4" w:space="0" w:color="2A2B2C"/>
+              <w:bottom w:val="single" w:sz="4" w:space="0" w:color="2A2B2C"/>
+              <w:right w:val="single" w:sz="4" w:space="0" w:color="2A2B2C"/>
+            </w:tcBorders>
+            <w:shd w:val="clear" w:color="auto" w:fill="B3E5A1" w:themeFill="accent6" w:themeFillTint="66"/>
+            <w:tcMar>
+              <w:top w:w="30" w:type="dxa"/>
+              <w:left w:w="30" w:type="dxa"/>
+              <w:bottom w:w="30" w:type="dxa"/>
+              <w:right w:w="30" w:type="dxa"/>
+            </w:tcMar>
             <w:vAlign w:val="center"/>
             <w:hideMark/>
           </w:tcPr>
           <w:p>
             <w:pPr>
               <w:spacing w:before="80" w:after="220"/>
-              <w:jc w:val="center"/>
-              <w:rPr>
-                <w:sz w:val="26"/>
-                <w:szCs w:val="26"/>
-              </w:rPr>
-            </w:pPr>
-            <w:r>
-              <w:rPr>
-                <w:sz w:val="26"/>
-                <w:szCs w:val="26"/>
-              </w:rPr>
-              <w:t>Hồ sơ tài liệu: độ chính xác từng trường</w:t>
+              <w:rPr>
+                <w:sz w:val="26"/>
+                <w:szCs w:val="26"/>
+              </w:rPr>
+            </w:pPr>
+            <w:r>
+              <w:rPr>
+                <w:sz w:val="26"/>
+                <w:szCs w:val="26"/>
+              </w:rPr>
+              <w:t xml:space="preserve">Latency p50 / p95 </w:t>
             </w:r>
           </w:p>
         </w:tc>
         <w:tc>
           <w:tcPr>
             <w:tcW w:w="0" w:type="auto"/>
+            <w:tcBorders>
+              <w:top w:val="single" w:sz="4" w:space="0" w:color="2A2B2C"/>
+              <w:left w:val="single" w:sz="4" w:space="0" w:color="2A2B2C"/>
+              <w:bottom w:val="single" w:sz="4" w:space="0" w:color="2A2B2C"/>
+              <w:right w:val="single" w:sz="4" w:space="0" w:color="2A2B2C"/>
+            </w:tcBorders>
+            <w:tcMar>
+              <w:top w:w="30" w:type="dxa"/>
+              <w:left w:w="30" w:type="dxa"/>
+              <w:bottom w:w="30" w:type="dxa"/>
+              <w:right w:w="30" w:type="dxa"/>
+            </w:tcMar>
             <w:vAlign w:val="center"/>
             <w:hideMark/>
           </w:tcPr>
           <w:p>
             <w:pPr>
               <w:spacing w:before="80" w:after="220"/>
-              <w:jc w:val="center"/>
-              <w:rPr>
-                <w:sz w:val="26"/>
-                <w:szCs w:val="26"/>
-              </w:rPr>
-            </w:pPr>
-            <w:r>
-              <w:rPr>
-                <w:sz w:val="26"/>
-                <w:szCs w:val="26"/>
-              </w:rPr>
-              <w:t>So với giá trị đã điền</w:t>
+              <w:rPr>
+                <w:sz w:val="26"/>
+                <w:szCs w:val="26"/>
+              </w:rPr>
+            </w:pPr>
+            <w:r>
+              <w:rPr>
+                <w:sz w:val="26"/>
+                <w:szCs w:val="26"/>
+              </w:rPr>
+              <w:t>Code</w:t>
             </w:r>
           </w:p>
         </w:tc>
         <w:tc>
           <w:tcPr>
             <w:tcW w:w="0" w:type="auto"/>
+            <w:tcBorders>
+              <w:top w:val="single" w:sz="4" w:space="0" w:color="2A2B2C"/>
+              <w:left w:val="single" w:sz="4" w:space="0" w:color="2A2B2C"/>
+              <w:bottom w:val="single" w:sz="4" w:space="0" w:color="2A2B2C"/>
+              <w:right w:val="single" w:sz="4" w:space="0" w:color="2A2B2C"/>
+            </w:tcBorders>
+            <w:tcMar>
+              <w:top w:w="30" w:type="dxa"/>
+              <w:left w:w="30" w:type="dxa"/>
+              <w:bottom w:w="30" w:type="dxa"/>
+              <w:right w:w="30" w:type="dxa"/>
+            </w:tcMar>
             <w:vAlign w:val="center"/>
             <w:hideMark/>
           </w:tcPr>
           <w:p>
             <w:pPr>
               <w:spacing w:before="80" w:after="220"/>
-              <w:jc w:val="center"/>
-              <w:rPr>
-                <w:sz w:val="26"/>
-                <w:szCs w:val="26"/>
-              </w:rPr>
-            </w:pPr>
-            <w:r>
-              <w:rPr>
-                <w:sz w:val="26"/>
-                <w:szCs w:val="26"/>
-              </w:rPr>
-              <w:t>Không</w:t>
+              <w:rPr>
+                <w:sz w:val="26"/>
+                <w:szCs w:val="26"/>
+              </w:rPr>
+            </w:pPr>
+            <w:r>
+              <w:rPr>
+                <w:sz w:val="26"/>
+                <w:szCs w:val="26"/>
+              </w:rPr>
+              <w:t>–</w:t>
+            </w:r>
+          </w:p>
+        </w:tc>
+        <w:tc>
+          <w:tcPr>
+            <w:tcW w:w="0" w:type="auto"/>
+            <w:tcBorders>
+              <w:top w:val="single" w:sz="4" w:space="0" w:color="2A2B2C"/>
+              <w:left w:val="single" w:sz="4" w:space="0" w:color="2A2B2C"/>
+              <w:bottom w:val="single" w:sz="4" w:space="0" w:color="2A2B2C"/>
+              <w:right w:val="single" w:sz="4" w:space="0" w:color="2A2B2C"/>
+            </w:tcBorders>
+            <w:tcMar>
+              <w:top w:w="30" w:type="dxa"/>
+              <w:left w:w="30" w:type="dxa"/>
+              <w:bottom w:w="30" w:type="dxa"/>
+              <w:right w:w="30" w:type="dxa"/>
+            </w:tcMar>
+            <w:vAlign w:val="center"/>
+            <w:hideMark/>
+          </w:tcPr>
+          <w:p>
+            <w:pPr>
+              <w:spacing w:before="80" w:after="220"/>
+              <w:rPr>
+                <w:sz w:val="26"/>
+                <w:szCs w:val="26"/>
+                <w:lang w:val="vi-VN"/>
+              </w:rPr>
+            </w:pPr>
+            <w:r>
+              <w:rPr>
+                <w:rFonts w:ascii="Segoe UI Emoji" w:hAnsi="Segoe UI Emoji" w:cs="Segoe UI Emoji"/>
+                <w:sz w:val="26"/>
+                <w:szCs w:val="26"/>
+              </w:rPr>
+              <w:t>⭐</w:t>
+            </w:r>
+            <w:r>
+              <w:rPr>
+                <w:sz w:val="26"/>
+                <w:szCs w:val="26"/>
+              </w:rPr>
+              <w:t xml:space="preserve"> Chính </w:t>
             </w:r>
           </w:p>
         </w:tc>
       </w:tr>
       <w:tr>
-        <w:trPr>
-          <w:tblCellSpacing w:w="15" w:type="dxa"/>
-        </w:trPr>
+        <w:tc>
+          <w:tcPr>
+            <w:tcW w:w="0" w:type="auto"/>
+            <w:tcBorders>
+              <w:top w:val="single" w:sz="4" w:space="0" w:color="2A2B2C"/>
+              <w:left w:val="single" w:sz="4" w:space="0" w:color="2A2B2C"/>
+              <w:bottom w:val="single" w:sz="4" w:space="0" w:color="2A2B2C"/>
+              <w:right w:val="single" w:sz="4" w:space="0" w:color="2A2B2C"/>
+            </w:tcBorders>
+            <w:tcMar>
+              <w:top w:w="30" w:type="dxa"/>
+              <w:left w:w="30" w:type="dxa"/>
+              <w:bottom w:w="30" w:type="dxa"/>
+              <w:right w:w="30" w:type="dxa"/>
+            </w:tcMar>
+            <w:vAlign w:val="center"/>
+            <w:hideMark/>
+          </w:tcPr>
+          <w:p>
+            <w:pPr>
+              <w:spacing w:before="80" w:after="220"/>
+              <w:rPr>
+                <w:sz w:val="26"/>
+                <w:szCs w:val="26"/>
+              </w:rPr>
+            </w:pPr>
+            <w:r>
+              <w:rPr>
+                <w:sz w:val="26"/>
+                <w:szCs w:val="26"/>
+              </w:rPr>
+              <w:t>16</w:t>
+            </w:r>
+          </w:p>
+        </w:tc>
         <w:tc>
           <w:tcPr>
             <w:tcW w:w="0" w:type="auto"/>
             <w:vMerge/>
+            <w:tcBorders>
+              <w:left w:val="single" w:sz="4" w:space="0" w:color="2A2B2C"/>
+              <w:bottom w:val="single" w:sz="4" w:space="0" w:color="2A2B2C"/>
+              <w:right w:val="single" w:sz="4" w:space="0" w:color="2A2B2C"/>
+            </w:tcBorders>
+            <w:tcMar>
+              <w:top w:w="30" w:type="dxa"/>
+              <w:left w:w="30" w:type="dxa"/>
+              <w:bottom w:w="30" w:type="dxa"/>
+              <w:right w:w="30" w:type="dxa"/>
+            </w:tcMar>
             <w:vAlign w:val="center"/>
             <w:hideMark/>
           </w:tcPr>
           <w:p>
             <w:pPr>
               <w:spacing w:before="80" w:after="220"/>
-              <w:jc w:val="center"/>
               <w:rPr>
                 <w:sz w:val="26"/>
                 <w:szCs w:val="26"/>
@@ -39622,175 +42164,140 @@
         <w:tc>
           <w:tcPr>
             <w:tcW w:w="0" w:type="auto"/>
+            <w:tcBorders>
+              <w:top w:val="single" w:sz="4" w:space="0" w:color="2A2B2C"/>
+              <w:left w:val="single" w:sz="4" w:space="0" w:color="2A2B2C"/>
+              <w:bottom w:val="single" w:sz="4" w:space="0" w:color="2A2B2C"/>
+              <w:right w:val="single" w:sz="4" w:space="0" w:color="2A2B2C"/>
+            </w:tcBorders>
+            <w:tcMar>
+              <w:top w:w="30" w:type="dxa"/>
+              <w:left w:w="30" w:type="dxa"/>
+              <w:bottom w:w="30" w:type="dxa"/>
+              <w:right w:w="30" w:type="dxa"/>
+            </w:tcMar>
             <w:vAlign w:val="center"/>
             <w:hideMark/>
           </w:tcPr>
           <w:p>
             <w:pPr>
               <w:spacing w:before="80" w:after="220"/>
-              <w:jc w:val="center"/>
-              <w:rPr>
-                <w:sz w:val="26"/>
-                <w:szCs w:val="26"/>
-              </w:rPr>
-            </w:pPr>
-            <w:r>
-              <w:rPr>
-                <w:sz w:val="26"/>
-                <w:szCs w:val="26"/>
-              </w:rPr>
-              <w:t>Tỉ lệ JSON hợp lệ</w:t>
+              <w:rPr>
+                <w:sz w:val="26"/>
+                <w:szCs w:val="26"/>
+              </w:rPr>
+            </w:pPr>
+            <w:r>
+              <w:rPr>
+                <w:sz w:val="26"/>
+                <w:szCs w:val="26"/>
+              </w:rPr>
+              <w:t>Timeout Rate</w:t>
             </w:r>
           </w:p>
         </w:tc>
         <w:tc>
           <w:tcPr>
             <w:tcW w:w="0" w:type="auto"/>
+            <w:tcBorders>
+              <w:top w:val="single" w:sz="4" w:space="0" w:color="2A2B2C"/>
+              <w:left w:val="single" w:sz="4" w:space="0" w:color="2A2B2C"/>
+              <w:bottom w:val="single" w:sz="4" w:space="0" w:color="2A2B2C"/>
+              <w:right w:val="single" w:sz="4" w:space="0" w:color="2A2B2C"/>
+            </w:tcBorders>
+            <w:tcMar>
+              <w:top w:w="30" w:type="dxa"/>
+              <w:left w:w="30" w:type="dxa"/>
+              <w:bottom w:w="30" w:type="dxa"/>
+              <w:right w:w="30" w:type="dxa"/>
+            </w:tcMar>
             <w:vAlign w:val="center"/>
             <w:hideMark/>
           </w:tcPr>
           <w:p>
             <w:pPr>
               <w:spacing w:before="80" w:after="220"/>
-              <w:jc w:val="center"/>
-              <w:rPr>
-                <w:sz w:val="26"/>
-                <w:szCs w:val="26"/>
-              </w:rPr>
-            </w:pPr>
-            <w:r>
-              <w:rPr>
-                <w:sz w:val="26"/>
-                <w:szCs w:val="26"/>
-              </w:rPr>
-              <w:t>Phân tích cú pháp và kiểm lược đồ</w:t>
+              <w:rPr>
+                <w:sz w:val="26"/>
+                <w:szCs w:val="26"/>
+              </w:rPr>
+            </w:pPr>
+            <w:r>
+              <w:rPr>
+                <w:sz w:val="26"/>
+                <w:szCs w:val="26"/>
+              </w:rPr>
+              <w:t>Code</w:t>
             </w:r>
           </w:p>
         </w:tc>
         <w:tc>
           <w:tcPr>
             <w:tcW w:w="0" w:type="auto"/>
+            <w:tcBorders>
+              <w:top w:val="single" w:sz="4" w:space="0" w:color="2A2B2C"/>
+              <w:left w:val="single" w:sz="4" w:space="0" w:color="2A2B2C"/>
+              <w:bottom w:val="single" w:sz="4" w:space="0" w:color="2A2B2C"/>
+              <w:right w:val="single" w:sz="4" w:space="0" w:color="2A2B2C"/>
+            </w:tcBorders>
+            <w:tcMar>
+              <w:top w:w="30" w:type="dxa"/>
+              <w:left w:w="30" w:type="dxa"/>
+              <w:bottom w:w="30" w:type="dxa"/>
+              <w:right w:w="30" w:type="dxa"/>
+            </w:tcMar>
             <w:vAlign w:val="center"/>
             <w:hideMark/>
           </w:tcPr>
           <w:p>
             <w:pPr>
               <w:spacing w:before="80" w:after="220"/>
-              <w:jc w:val="center"/>
-              <w:rPr>
-                <w:sz w:val="26"/>
-                <w:szCs w:val="26"/>
-              </w:rPr>
-            </w:pPr>
-            <w:r>
-              <w:rPr>
-                <w:sz w:val="26"/>
-                <w:szCs w:val="26"/>
-              </w:rPr>
-              <w:t>Không</w:t>
-            </w:r>
-          </w:p>
-        </w:tc>
-      </w:tr>
-      <w:tr>
-        <w:trPr>
-          <w:tblCellSpacing w:w="15" w:type="dxa"/>
-        </w:trPr>
+              <w:rPr>
+                <w:sz w:val="26"/>
+                <w:szCs w:val="26"/>
+              </w:rPr>
+            </w:pPr>
+            <w:r>
+              <w:rPr>
+                <w:sz w:val="26"/>
+                <w:szCs w:val="26"/>
+              </w:rPr>
+              <w:t>–</w:t>
+            </w:r>
+          </w:p>
+        </w:tc>
         <w:tc>
           <w:tcPr>
             <w:tcW w:w="0" w:type="auto"/>
+            <w:tcBorders>
+              <w:top w:val="single" w:sz="4" w:space="0" w:color="2A2B2C"/>
+              <w:left w:val="single" w:sz="4" w:space="0" w:color="2A2B2C"/>
+              <w:bottom w:val="single" w:sz="4" w:space="0" w:color="2A2B2C"/>
+              <w:right w:val="single" w:sz="4" w:space="0" w:color="2A2B2C"/>
+            </w:tcBorders>
+            <w:tcMar>
+              <w:top w:w="30" w:type="dxa"/>
+              <w:left w:w="30" w:type="dxa"/>
+              <w:bottom w:w="30" w:type="dxa"/>
+              <w:right w:w="30" w:type="dxa"/>
+            </w:tcMar>
             <w:vAlign w:val="center"/>
             <w:hideMark/>
           </w:tcPr>
           <w:p>
             <w:pPr>
               <w:spacing w:before="80" w:after="220"/>
-              <w:jc w:val="center"/>
-              <w:rPr>
-                <w:sz w:val="26"/>
-                <w:szCs w:val="26"/>
-              </w:rPr>
-            </w:pPr>
-            <w:r>
-              <w:rPr>
-                <w:b/>
-                <w:bCs/>
-                <w:sz w:val="26"/>
-                <w:szCs w:val="26"/>
-              </w:rPr>
-              <w:t>5. Hệ thống</w:t>
-            </w:r>
-          </w:p>
-        </w:tc>
-        <w:tc>
-          <w:tcPr>
-            <w:tcW w:w="0" w:type="auto"/>
-            <w:vAlign w:val="center"/>
-            <w:hideMark/>
-          </w:tcPr>
-          <w:p>
-            <w:pPr>
-              <w:spacing w:before="80" w:after="220"/>
-              <w:jc w:val="center"/>
-              <w:rPr>
-                <w:sz w:val="26"/>
-                <w:szCs w:val="26"/>
-              </w:rPr>
-            </w:pPr>
-            <w:r>
-              <w:rPr>
-                <w:sz w:val="26"/>
-                <w:szCs w:val="26"/>
-              </w:rPr>
-              <w:t>Độ trễ p50, p95 theo luồng; RAM đỉnh; số lượt gọi LLM</w:t>
-            </w:r>
-          </w:p>
-        </w:tc>
-        <w:tc>
-          <w:tcPr>
-            <w:tcW w:w="0" w:type="auto"/>
-            <w:vAlign w:val="center"/>
-            <w:hideMark/>
-          </w:tcPr>
-          <w:p>
-            <w:pPr>
-              <w:spacing w:before="80" w:after="220"/>
-              <w:jc w:val="center"/>
-              <w:rPr>
-                <w:sz w:val="26"/>
-                <w:szCs w:val="26"/>
-              </w:rPr>
-            </w:pPr>
-            <w:r>
-              <w:rPr>
-                <w:sz w:val="26"/>
-                <w:szCs w:val="26"/>
-              </w:rPr>
-              <w:t>Langfuse, psutil</w:t>
-            </w:r>
-          </w:p>
-        </w:tc>
-        <w:tc>
-          <w:tcPr>
-            <w:tcW w:w="0" w:type="auto"/>
-            <w:vAlign w:val="center"/>
-            <w:hideMark/>
-          </w:tcPr>
-          <w:p>
-            <w:pPr>
-              <w:spacing w:before="80" w:after="220"/>
-              <w:jc w:val="center"/>
-              <w:rPr>
-                <w:sz w:val="26"/>
-                <w:szCs w:val="26"/>
-              </w:rPr>
-            </w:pPr>
-            <w:r>
-              <w:rPr>
-                <w:sz w:val="26"/>
-                <w:szCs w:val="26"/>
-              </w:rPr>
-              <w:t>Không</w:t>
+              <w:rPr>
+                <w:sz w:val="26"/>
+                <w:szCs w:val="26"/>
+              </w:rPr>
+            </w:pPr>
+            <w:r>
+              <w:rPr>
+                <w:sz w:val="26"/>
+                <w:szCs w:val="26"/>
+              </w:rPr>
+              <w:t>Phụ</w:t>
             </w:r>
           </w:p>
         </w:tc>
@@ -39799,7 +42306,6 @@
     <w:p>
       <w:pPr>
         <w:spacing w:before="80" w:after="220"/>
-        <w:jc w:val="center"/>
         <w:rPr>
           <w:sz w:val="26"/>
           <w:szCs w:val="26"/>
@@ -39998,6 +42504,7 @@
         <w:rPr>
           <w:sz w:val="26"/>
           <w:szCs w:val="26"/>
+          <w:lang w:val="vi-VN"/>
         </w:rPr>
       </w:pPr>
       <w:bookmarkStart w:id="88" w:name="_Toc241611163"/>
@@ -40005,8 +42512,8 @@
         <w:rPr>
           <w:sz w:val="26"/>
           <w:szCs w:val="26"/>
-        </w:rPr>
-        <w:lastRenderedPageBreak/>
+          <w:lang w:val="vi-VN"/>
+        </w:rPr>
         <w:t>Bộ kiểm thử</w:t>
       </w:r>
       <w:bookmarkEnd w:id="88"/>
@@ -40017,12 +42524,14 @@
         <w:rPr>
           <w:sz w:val="26"/>
           <w:szCs w:val="26"/>
+          <w:lang w:val="vi-VN"/>
         </w:rPr>
       </w:pPr>
       <w:r>
         <w:rPr>
           <w:sz w:val="26"/>
           <w:szCs w:val="26"/>
+          <w:lang w:val="vi-VN"/>
         </w:rPr>
         <w:t>Bộ kiểm thử gồm hai mươi tài liệu, mỗi tài liệu ba đến bốn câu hỏi kèm đáp án đúng và vị trí đoạn chứa đáp án. Do tính chất bảo mật của miền ứng dụng, bộ dữ liệu được xây dựng từ mẫu hợp đồng công khai kết hợp dữ liệu tổng hợp, theo cách tiếp cận tương tự các bộ dữ liệu hợp đồng lấy nguồn từ hồ sơ công khai.</w:t>
       </w:r>
@@ -40033,12 +42542,14 @@
         <w:rPr>
           <w:sz w:val="26"/>
           <w:szCs w:val="26"/>
+          <w:lang w:val="vi-VN"/>
         </w:rPr>
       </w:pPr>
       <w:r>
         <w:rPr>
           <w:sz w:val="26"/>
           <w:szCs w:val="26"/>
+          <w:lang w:val="vi-VN"/>
         </w:rPr>
         <w:t>Bộ kiểm thử phải được xây dựng song song với quá trình phát triển, không để tới giai đoạn cuối. Đây là hạng mục thường bị ước lượng thiếu thời gian nhất.</w:t>
       </w:r>
@@ -40050,6 +42561,7 @@
         <w:rPr>
           <w:sz w:val="26"/>
           <w:szCs w:val="26"/>
+          <w:lang w:val="vi-VN"/>
         </w:rPr>
       </w:pPr>
       <w:bookmarkStart w:id="89" w:name="_Toc241611164"/>
@@ -40057,6 +42569,7 @@
         <w:rPr>
           <w:sz w:val="26"/>
           <w:szCs w:val="26"/>
+          <w:lang w:val="vi-VN"/>
         </w:rPr>
         <w:t>Bảng phân tích thành phần</w:t>
       </w:r>
@@ -40068,12 +42581,14 @@
         <w:rPr>
           <w:sz w:val="26"/>
           <w:szCs w:val="26"/>
+          <w:lang w:val="vi-VN"/>
         </w:rPr>
       </w:pPr>
       <w:r>
         <w:rPr>
           <w:sz w:val="26"/>
           <w:szCs w:val="26"/>
+          <w:lang w:val="vi-VN"/>
         </w:rPr>
         <w:t>Ngoài các chỉ số trên, cần bảng phân tích đóng góp của từng thành phần theo sáu cấu hình R0 đến R5 đã thiết kế ở Bảng 6.5: từ RAG cơ bản, lần lượt thêm chia đoạn theo cấu trúc, tiêu đề ngữ cảnh, vector thưa, xếp hạng lại, và cuối cùng là kiểm chứng với vòng truy xuất lại. Bảng này thể hiện đóng góp khoa học của đồ án rõ hơn bản thân hệ thống.</w:t>
       </w:r>
@@ -40430,6 +42945,7 @@
                 <w:sz w:val="26"/>
                 <w:szCs w:val="26"/>
               </w:rPr>
+              <w:lastRenderedPageBreak/>
               <w:t>Hệ sinh thái thư viện thay đổi giao diện lập trình</w:t>
             </w:r>
           </w:p>
@@ -40680,7 +43196,6 @@
                 <w:sz w:val="26"/>
                 <w:szCs w:val="26"/>
               </w:rPr>
-              <w:lastRenderedPageBreak/>
               <w:t>Ngưỡng cổng chất lượng văn bản, ngưỡng xếp hạng lại, ngưỡng 20% chưa hiệu chỉnh</w:t>
             </w:r>
           </w:p>
@@ -41072,6 +43587,7 @@
           <w:sz w:val="26"/>
           <w:szCs w:val="26"/>
         </w:rPr>
+        <w:lastRenderedPageBreak/>
         <w:br w:type="page"/>
       </w:r>
     </w:p>

</xml_diff>